<commit_message>
Took off the extra line for the judge's signature (03/07/2023)
</commit_message>
<xml_diff>
--- a/docassemble/Motionforcontempt/data/templates/motionforcontempt.docx
+++ b/docassemble/Motionforcontempt/data/templates/motionforcontempt.docx
@@ -914,7 +914,23 @@
           <w:rFonts w:ascii="Arial"/>
           <w:sz w:val="28"/>
         </w:rPr>
-        <w:t xml:space="preserve">This packet of forms is not legal advice and cannot take the place of the advice that a lawyer can give you. It is always be </w:t>
+        <w:t xml:space="preserve">This packet of forms is not legal advice and cannot take the place of the advice that a lawyer can give you. It </w:t>
+      </w:r>
+      <w:proofErr w:type="gramStart"/>
+      <w:r>
+        <w:rPr>
+          <w:rFonts w:ascii="Arial"/>
+          <w:sz w:val="28"/>
+        </w:rPr>
+        <w:t>is always be</w:t>
+      </w:r>
+      <w:proofErr w:type="gramEnd"/>
+      <w:r>
+        <w:rPr>
+          <w:rFonts w:ascii="Arial"/>
+          <w:sz w:val="28"/>
+        </w:rPr>
+        <w:t xml:space="preserve"> </w:t>
       </w:r>
       <w:hyperlink r:id="rId7">
         <w:r>
@@ -1590,7 +1606,21 @@
         <w:rPr>
           <w:sz w:val="28"/>
         </w:rPr>
-        <w:t>(i.e. evidence that supports your case, such as phone records or a doctor’s note).</w:t>
+        <w:t>(</w:t>
+      </w:r>
+      <w:proofErr w:type="gramStart"/>
+      <w:r>
+        <w:rPr>
+          <w:sz w:val="28"/>
+        </w:rPr>
+        <w:t>i.e.</w:t>
+      </w:r>
+      <w:proofErr w:type="gramEnd"/>
+      <w:r>
+        <w:rPr>
+          <w:sz w:val="28"/>
+        </w:rPr>
+        <w:t xml:space="preserve"> evidence that supports your case, such as phone records or a doctor’s note).</w:t>
       </w:r>
     </w:p>
     <w:p>
@@ -1788,13 +1818,1175 @@
       </w:pPr>
       <w:r>
         <w:rPr>
+          <w:b w:val="0"/>
           <w:noProof/>
+          <w:szCs w:val="44"/>
         </w:rPr>
         <w:lastRenderedPageBreak/>
         <mc:AlternateContent>
           <mc:Choice Requires="wps">
             <w:drawing>
-              <wp:anchor distT="45720" distB="45720" distL="114300" distR="114300" simplePos="0" relativeHeight="251659264" behindDoc="0" locked="0" layoutInCell="1" allowOverlap="1" wp14:anchorId="028CBD92" wp14:editId="547DE6A2">
+              <wp:anchor distT="45720" distB="45720" distL="114300" distR="114300" simplePos="0" relativeHeight="251656192" behindDoc="0" locked="0" layoutInCell="1" allowOverlap="1" wp14:anchorId="29946CE2" wp14:editId="23704E07">
+                <wp:simplePos x="0" y="0"/>
+                <wp:positionH relativeFrom="column">
+                  <wp:posOffset>-245745</wp:posOffset>
+                </wp:positionH>
+                <wp:positionV relativeFrom="paragraph">
+                  <wp:posOffset>-5080</wp:posOffset>
+                </wp:positionV>
+                <wp:extent cx="2360930" cy="2303780"/>
+                <wp:effectExtent l="0" t="0" r="0" b="1270"/>
+                <wp:wrapSquare wrapText="bothSides"/>
+                <wp:docPr id="217" name="Text Box 2"/>
+                <wp:cNvGraphicFramePr>
+                  <a:graphicFrameLocks xmlns:a="http://schemas.openxmlformats.org/drawingml/2006/main"/>
+                </wp:cNvGraphicFramePr>
+                <a:graphic xmlns:a="http://schemas.openxmlformats.org/drawingml/2006/main">
+                  <a:graphicData uri="http://schemas.microsoft.com/office/word/2010/wordprocessingShape">
+                    <wps:wsp>
+                      <wps:cNvSpPr txBox="1">
+                        <a:spLocks noChangeArrowheads="1"/>
+                      </wps:cNvSpPr>
+                      <wps:spPr bwMode="auto">
+                        <a:xfrm>
+                          <a:off x="0" y="0"/>
+                          <a:ext cx="2360930" cy="2303780"/>
+                        </a:xfrm>
+                        <a:prstGeom prst="rect">
+                          <a:avLst/>
+                        </a:prstGeom>
+                        <a:solidFill>
+                          <a:srgbClr val="FFFFFF"/>
+                        </a:solidFill>
+                        <a:ln w="9525">
+                          <a:noFill/>
+                          <a:miter lim="800000"/>
+                          <a:headEnd/>
+                          <a:tailEnd/>
+                        </a:ln>
+                      </wps:spPr>
+                      <wps:txbx>
+                        <w:txbxContent>
+                          <w:p>
+                            <w:pPr>
+                              <w:spacing w:before="143"/>
+                              <w:rPr>
+                                <w:bCs/>
+                                <w:spacing w:val="-2"/>
+                                <w:sz w:val="24"/>
+                                <w:szCs w:val="36"/>
+                              </w:rPr>
+                            </w:pPr>
+                            <w:r>
+                              <w:rPr>
+                                <w:bCs/>
+                                <w:spacing w:val="-2"/>
+                                <w:sz w:val="24"/>
+                                <w:szCs w:val="36"/>
+                              </w:rPr>
+                              <w:t xml:space="preserve">{% if </w:t>
+                            </w:r>
+                            <w:proofErr w:type="spellStart"/>
+                            <w:r>
+                              <w:rPr>
+                                <w:bCs/>
+                                <w:spacing w:val="-2"/>
+                                <w:sz w:val="24"/>
+                                <w:szCs w:val="36"/>
+                              </w:rPr>
+                              <w:t>user_ask_role</w:t>
+                            </w:r>
+                            <w:proofErr w:type="spellEnd"/>
+                            <w:r>
+                              <w:rPr>
+                                <w:bCs/>
+                                <w:spacing w:val="-2"/>
+                                <w:sz w:val="24"/>
+                                <w:szCs w:val="36"/>
+                              </w:rPr>
+                              <w:t xml:space="preserve"> == ‘pla</w:t>
+                            </w:r>
+                            <w:r>
+                              <w:rPr>
+                                <w:bCs/>
+                                <w:spacing w:val="-2"/>
+                                <w:sz w:val="24"/>
+                                <w:szCs w:val="36"/>
+                              </w:rPr>
+                              <w:t>i</w:t>
+                            </w:r>
+                            <w:r>
+                              <w:rPr>
+                                <w:bCs/>
+                                <w:spacing w:val="-2"/>
+                                <w:sz w:val="24"/>
+                                <w:szCs w:val="36"/>
+                              </w:rPr>
+                              <w:t>ntiff</w:t>
+                            </w:r>
+                            <w:r>
+                              <w:rPr>
+                                <w:bCs/>
+                                <w:spacing w:val="-2"/>
+                                <w:sz w:val="24"/>
+                                <w:szCs w:val="36"/>
+                              </w:rPr>
+                              <w:t>’</w:t>
+                            </w:r>
+                            <w:r>
+                              <w:rPr>
+                                <w:bCs/>
+                                <w:spacing w:val="-2"/>
+                                <w:sz w:val="24"/>
+                                <w:szCs w:val="36"/>
+                              </w:rPr>
+                              <w:t xml:space="preserve"> </w:t>
+                            </w:r>
+                            <w:proofErr w:type="gramStart"/>
+                            <w:r>
+                              <w:rPr>
+                                <w:bCs/>
+                                <w:spacing w:val="-2"/>
+                                <w:sz w:val="24"/>
+                                <w:szCs w:val="36"/>
+                              </w:rPr>
+                              <w:t>%}</w:t>
+                            </w:r>
+                            <w:r>
+                              <w:rPr>
+                                <w:b/>
+                                <w:spacing w:val="-2"/>
+                                <w:sz w:val="24"/>
+                                <w:szCs w:val="36"/>
+                                <w:u w:val="single"/>
+                              </w:rPr>
+                              <w:t>{</w:t>
+                            </w:r>
+                            <w:proofErr w:type="gramEnd"/>
+                            <w:r>
+                              <w:rPr>
+                                <w:b/>
+                                <w:spacing w:val="-2"/>
+                                <w:sz w:val="24"/>
+                                <w:szCs w:val="36"/>
+                                <w:u w:val="single"/>
+                              </w:rPr>
+                              <w:t>{</w:t>
+                            </w:r>
+                            <w:r>
+                              <w:rPr>
+                                <w:b/>
+                                <w:spacing w:val="-2"/>
+                                <w:sz w:val="24"/>
+                                <w:szCs w:val="36"/>
+                                <w:u w:val="single"/>
+                              </w:rPr>
+                              <w:t xml:space="preserve"> </w:t>
+                            </w:r>
+                            <w:proofErr w:type="spellStart"/>
+                            <w:r>
+                              <w:rPr>
+                                <w:b/>
+                                <w:spacing w:val="-2"/>
+                                <w:sz w:val="24"/>
+                                <w:szCs w:val="36"/>
+                                <w:u w:val="single"/>
+                              </w:rPr>
+                              <w:t>us</w:t>
+                            </w:r>
+                            <w:r>
+                              <w:rPr>
+                                <w:b/>
+                                <w:spacing w:val="-2"/>
+                                <w:sz w:val="24"/>
+                                <w:szCs w:val="36"/>
+                                <w:u w:val="single"/>
+                              </w:rPr>
+                              <w:t>er</w:t>
+                            </w:r>
+                            <w:r>
+                              <w:rPr>
+                                <w:b/>
+                                <w:spacing w:val="-2"/>
+                                <w:sz w:val="24"/>
+                                <w:szCs w:val="36"/>
+                                <w:u w:val="single"/>
+                              </w:rPr>
+                              <w:t>_names</w:t>
+                            </w:r>
+                            <w:proofErr w:type="spellEnd"/>
+                            <w:r>
+                              <w:rPr>
+                                <w:b/>
+                                <w:spacing w:val="-2"/>
+                                <w:sz w:val="24"/>
+                                <w:szCs w:val="36"/>
+                                <w:u w:val="single"/>
+                              </w:rPr>
+                              <w:t>}}</w:t>
+                            </w:r>
+                            <w:r>
+                              <w:rPr>
+                                <w:bCs/>
+                                <w:spacing w:val="-2"/>
+                                <w:sz w:val="24"/>
+                                <w:szCs w:val="36"/>
+                              </w:rPr>
+                              <w:t>{% else %}</w:t>
+                            </w:r>
+                            <w:r>
+                              <w:rPr>
+                                <w:b/>
+                                <w:spacing w:val="-2"/>
+                                <w:sz w:val="24"/>
+                                <w:szCs w:val="36"/>
+                                <w:u w:val="single"/>
+                              </w:rPr>
+                              <w:t xml:space="preserve">{{ </w:t>
+                            </w:r>
+                            <w:proofErr w:type="spellStart"/>
+                            <w:r>
+                              <w:rPr>
+                                <w:b/>
+                                <w:spacing w:val="-2"/>
+                                <w:sz w:val="24"/>
+                                <w:szCs w:val="36"/>
+                                <w:u w:val="single"/>
+                              </w:rPr>
+                              <w:t>other_parties_names</w:t>
+                            </w:r>
+                            <w:proofErr w:type="spellEnd"/>
+                            <w:r>
+                              <w:rPr>
+                                <w:b/>
+                                <w:spacing w:val="-2"/>
+                                <w:sz w:val="24"/>
+                                <w:szCs w:val="36"/>
+                                <w:u w:val="single"/>
+                              </w:rPr>
+                              <w:t xml:space="preserve"> }}</w:t>
+                            </w:r>
+                            <w:r>
+                              <w:rPr>
+                                <w:bCs/>
+                                <w:spacing w:val="-2"/>
+                                <w:sz w:val="24"/>
+                                <w:szCs w:val="36"/>
+                              </w:rPr>
+                              <w:t xml:space="preserve">{% </w:t>
+                            </w:r>
+                            <w:r>
+                              <w:rPr>
+                                <w:bCs/>
+                                <w:spacing w:val="-2"/>
+                                <w:sz w:val="24"/>
+                                <w:szCs w:val="36"/>
+                              </w:rPr>
+                              <w:t>endif %}</w:t>
+                            </w:r>
+                          </w:p>
+                          <w:p>
+                            <w:pPr>
+                              <w:ind w:left="1662"/>
+                              <w:rPr>
+                                <w:b/>
+                                <w:spacing w:val="-2"/>
+                                <w:sz w:val="16"/>
+                              </w:rPr>
+                            </w:pPr>
+                          </w:p>
+                          <w:p>
+                            <w:pPr>
+                              <w:ind w:left="1662"/>
+                              <w:rPr>
+                                <w:b/>
+                                <w:spacing w:val="-2"/>
+                                <w:sz w:val="16"/>
+                              </w:rPr>
+                            </w:pPr>
+                            <w:r>
+                              <w:rPr>
+                                <w:b/>
+                                <w:spacing w:val="-2"/>
+                                <w:sz w:val="16"/>
+                              </w:rPr>
+                              <w:t>(</w:t>
+                            </w:r>
+                            <w:r>
+                              <w:rPr>
+                                <w:b/>
+                                <w:spacing w:val="-2"/>
+                                <w:sz w:val="13"/>
+                              </w:rPr>
+                              <w:t>PETITIONER</w:t>
+                            </w:r>
+                            <w:r>
+                              <w:rPr>
+                                <w:b/>
+                                <w:spacing w:val="-2"/>
+                                <w:sz w:val="16"/>
+                              </w:rPr>
+                              <w:t>)</w:t>
+                            </w:r>
+                          </w:p>
+                          <w:p>
+                            <w:pPr>
+                              <w:rPr>
+                                <w:b/>
+                                <w:spacing w:val="-2"/>
+                                <w:sz w:val="24"/>
+                              </w:rPr>
+                            </w:pPr>
+                            <w:r>
+                              <w:rPr>
+                                <w:b/>
+                                <w:spacing w:val="-2"/>
+                                <w:sz w:val="24"/>
+                              </w:rPr>
+                              <w:t>VERSUS</w:t>
+                            </w:r>
+                          </w:p>
+                          <w:p>
+                            <w:pPr>
+                              <w:rPr>
+                                <w:b/>
+                                <w:spacing w:val="-2"/>
+                                <w:sz w:val="24"/>
+                              </w:rPr>
+                            </w:pPr>
+                          </w:p>
+                          <w:p>
+                            <w:pPr>
+                              <w:rPr>
+                                <w:b/>
+                                <w:bCs/>
+                                <w:sz w:val="24"/>
+                                <w:szCs w:val="24"/>
+                                <w:u w:val="single"/>
+                              </w:rPr>
+                            </w:pPr>
+                            <w:r>
+                              <w:rPr>
+                                <w:bCs/>
+                                <w:spacing w:val="-2"/>
+                                <w:sz w:val="24"/>
+                                <w:szCs w:val="36"/>
+                              </w:rPr>
+                              <w:t xml:space="preserve">{% if </w:t>
+                            </w:r>
+                            <w:proofErr w:type="spellStart"/>
+                            <w:r>
+                              <w:rPr>
+                                <w:bCs/>
+                                <w:spacing w:val="-2"/>
+                                <w:sz w:val="24"/>
+                                <w:szCs w:val="36"/>
+                              </w:rPr>
+                              <w:t>user_ask_role</w:t>
+                            </w:r>
+                            <w:proofErr w:type="spellEnd"/>
+                            <w:r>
+                              <w:rPr>
+                                <w:bCs/>
+                                <w:spacing w:val="-2"/>
+                                <w:sz w:val="24"/>
+                                <w:szCs w:val="36"/>
+                              </w:rPr>
+                              <w:t xml:space="preserve"> == </w:t>
+                            </w:r>
+                            <w:r>
+                              <w:rPr>
+                                <w:bCs/>
+                                <w:spacing w:val="-2"/>
+                                <w:sz w:val="24"/>
+                                <w:szCs w:val="36"/>
+                              </w:rPr>
+                              <w:t>‘</w:t>
+                            </w:r>
+                            <w:r>
+                              <w:rPr>
+                                <w:bCs/>
+                                <w:spacing w:val="-2"/>
+                                <w:sz w:val="24"/>
+                                <w:szCs w:val="36"/>
+                              </w:rPr>
+                              <w:t>defendant’ %}</w:t>
+                            </w:r>
+                            <w:r>
+                              <w:rPr>
+                                <w:sz w:val="24"/>
+                                <w:szCs w:val="24"/>
+                              </w:rPr>
+                              <w:t xml:space="preserve"> </w:t>
+                            </w:r>
+                            <w:proofErr w:type="gramStart"/>
+                            <w:r>
+                              <w:rPr>
+                                <w:b/>
+                                <w:bCs/>
+                                <w:sz w:val="24"/>
+                                <w:szCs w:val="24"/>
+                                <w:u w:val="single"/>
+                              </w:rPr>
+                              <w:t>{{</w:t>
+                            </w:r>
+                            <w:r>
+                              <w:rPr>
+                                <w:b/>
+                                <w:bCs/>
+                                <w:sz w:val="24"/>
+                                <w:szCs w:val="24"/>
+                                <w:u w:val="single"/>
+                              </w:rPr>
+                              <w:t xml:space="preserve"> </w:t>
+                            </w:r>
+                            <w:proofErr w:type="spellStart"/>
+                            <w:r>
+                              <w:rPr>
+                                <w:b/>
+                                <w:bCs/>
+                                <w:sz w:val="24"/>
+                                <w:szCs w:val="24"/>
+                                <w:u w:val="single"/>
+                              </w:rPr>
+                              <w:t>user</w:t>
+                            </w:r>
+                            <w:proofErr w:type="gramEnd"/>
+                            <w:r>
+                              <w:rPr>
+                                <w:b/>
+                                <w:bCs/>
+                                <w:sz w:val="24"/>
+                                <w:szCs w:val="24"/>
+                                <w:u w:val="single"/>
+                              </w:rPr>
+                              <w:t>_names</w:t>
+                            </w:r>
+                            <w:proofErr w:type="spellEnd"/>
+                            <w:r>
+                              <w:rPr>
+                                <w:b/>
+                                <w:bCs/>
+                                <w:sz w:val="24"/>
+                                <w:szCs w:val="24"/>
+                                <w:u w:val="single"/>
+                              </w:rPr>
+                              <w:t xml:space="preserve"> }}</w:t>
+                            </w:r>
+                          </w:p>
+                          <w:p>
+                            <w:pPr>
+                              <w:rPr>
+                                <w:sz w:val="24"/>
+                                <w:szCs w:val="24"/>
+                              </w:rPr>
+                            </w:pPr>
+                            <w:r>
+                              <w:rPr>
+                                <w:bCs/>
+                                <w:spacing w:val="-2"/>
+                                <w:sz w:val="24"/>
+                                <w:szCs w:val="36"/>
+                              </w:rPr>
+                              <w:t xml:space="preserve">{% else </w:t>
+                            </w:r>
+                            <w:proofErr w:type="gramStart"/>
+                            <w:r>
+                              <w:rPr>
+                                <w:bCs/>
+                                <w:spacing w:val="-2"/>
+                                <w:sz w:val="24"/>
+                                <w:szCs w:val="36"/>
+                              </w:rPr>
+                              <w:t>%}</w:t>
+                            </w:r>
+                            <w:r>
+                              <w:rPr>
+                                <w:b/>
+                                <w:spacing w:val="-2"/>
+                                <w:sz w:val="24"/>
+                                <w:szCs w:val="36"/>
+                                <w:u w:val="single"/>
+                              </w:rPr>
+                              <w:t>{</w:t>
+                            </w:r>
+                            <w:proofErr w:type="gramEnd"/>
+                            <w:r>
+                              <w:rPr>
+                                <w:b/>
+                                <w:spacing w:val="-2"/>
+                                <w:sz w:val="24"/>
+                                <w:szCs w:val="36"/>
+                                <w:u w:val="single"/>
+                              </w:rPr>
+                              <w:t xml:space="preserve">{ </w:t>
+                            </w:r>
+                            <w:proofErr w:type="spellStart"/>
+                            <w:r>
+                              <w:rPr>
+                                <w:b/>
+                                <w:spacing w:val="-2"/>
+                                <w:sz w:val="24"/>
+                                <w:szCs w:val="36"/>
+                                <w:u w:val="single"/>
+                              </w:rPr>
+                              <w:t>other_parties</w:t>
+                            </w:r>
+                            <w:r>
+                              <w:rPr>
+                                <w:b/>
+                                <w:spacing w:val="-2"/>
+                                <w:sz w:val="24"/>
+                                <w:szCs w:val="36"/>
+                                <w:u w:val="single"/>
+                              </w:rPr>
+                              <w:t>_names</w:t>
+                            </w:r>
+                            <w:proofErr w:type="spellEnd"/>
+                            <w:r>
+                              <w:rPr>
+                                <w:b/>
+                                <w:spacing w:val="-2"/>
+                                <w:sz w:val="24"/>
+                                <w:szCs w:val="36"/>
+                                <w:u w:val="single"/>
+                              </w:rPr>
+                              <w:t xml:space="preserve"> }}</w:t>
+                            </w:r>
+                            <w:r>
+                              <w:rPr>
+                                <w:bCs/>
+                                <w:spacing w:val="-2"/>
+                                <w:sz w:val="24"/>
+                                <w:szCs w:val="36"/>
+                              </w:rPr>
+                              <w:t xml:space="preserve">{% </w:t>
+                            </w:r>
+                            <w:r>
+                              <w:rPr>
+                                <w:bCs/>
+                                <w:spacing w:val="-2"/>
+                                <w:sz w:val="24"/>
+                                <w:szCs w:val="36"/>
+                              </w:rPr>
+                              <w:t>endif %}</w:t>
+                            </w:r>
+                          </w:p>
+                          <w:p>
+                            <w:pPr>
+                              <w:spacing w:line="183" w:lineRule="exact"/>
+                              <w:ind w:left="1713"/>
+                              <w:rPr>
+                                <w:b/>
+                                <w:sz w:val="16"/>
+                              </w:rPr>
+                            </w:pPr>
+                            <w:r>
+                              <w:rPr>
+                                <w:b/>
+                                <w:spacing w:val="-2"/>
+                                <w:sz w:val="13"/>
+                              </w:rPr>
+                              <w:t>(DEFENDANT</w:t>
+                            </w:r>
+                            <w:r>
+                              <w:rPr>
+                                <w:b/>
+                                <w:spacing w:val="-2"/>
+                                <w:sz w:val="16"/>
+                              </w:rPr>
+                              <w:t>)</w:t>
+                            </w:r>
+                          </w:p>
+                          <w:p>
+                            <w:pPr>
+                              <w:rPr>
+                                <w:b/>
+                                <w:sz w:val="16"/>
+                              </w:rPr>
+                            </w:pPr>
+                          </w:p>
+                        </w:txbxContent>
+                      </wps:txbx>
+                      <wps:bodyPr rot="0" vert="horz" wrap="square" lIns="91440" tIns="45720" rIns="91440" bIns="45720" anchor="t" anchorCtr="0">
+                        <a:noAutofit/>
+                      </wps:bodyPr>
+                    </wps:wsp>
+                  </a:graphicData>
+                </a:graphic>
+                <wp14:sizeRelH relativeFrom="margin">
+                  <wp14:pctWidth>40000</wp14:pctWidth>
+                </wp14:sizeRelH>
+                <wp14:sizeRelV relativeFrom="margin">
+                  <wp14:pctHeight>0</wp14:pctHeight>
+                </wp14:sizeRelV>
+              </wp:anchor>
+            </w:drawing>
+          </mc:Choice>
+          <mc:Fallback>
+            <w:pict>
+              <v:shapetype w14:anchorId="29946CE2" id="_x0000_t202" coordsize="21600,21600" o:spt="202" path="m,l,21600r21600,l21600,xe">
+                <v:stroke joinstyle="miter"/>
+                <v:path gradientshapeok="t" o:connecttype="rect"/>
+              </v:shapetype>
+              <v:shape id="Text Box 2" o:spid="_x0000_s1026" type="#_x0000_t202" style="position:absolute;margin-left:-19.35pt;margin-top:-.4pt;width:185.9pt;height:181.4pt;z-index:251656192;visibility:visible;mso-wrap-style:square;mso-width-percent:400;mso-height-percent:0;mso-wrap-distance-left:9pt;mso-wrap-distance-top:3.6pt;mso-wrap-distance-right:9pt;mso-wrap-distance-bottom:3.6pt;mso-position-horizontal:absolute;mso-position-horizontal-relative:text;mso-position-vertical:absolute;mso-position-vertical-relative:text;mso-width-percent:400;mso-height-percent:0;mso-width-relative:margin;mso-height-relative:margin;v-text-anchor:top" o:gfxdata="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" stroked="f">
+                <v:textbox>
+                  <w:txbxContent>
+                    <w:p>
+                      <w:pPr>
+                        <w:spacing w:before="143"/>
+                        <w:rPr>
+                          <w:bCs/>
+                          <w:spacing w:val="-2"/>
+                          <w:sz w:val="24"/>
+                          <w:szCs w:val="36"/>
+                        </w:rPr>
+                      </w:pPr>
+                      <w:r>
+                        <w:rPr>
+                          <w:bCs/>
+                          <w:spacing w:val="-2"/>
+                          <w:sz w:val="24"/>
+                          <w:szCs w:val="36"/>
+                        </w:rPr>
+                        <w:t xml:space="preserve">{% if </w:t>
+                      </w:r>
+                      <w:proofErr w:type="spellStart"/>
+                      <w:r>
+                        <w:rPr>
+                          <w:bCs/>
+                          <w:spacing w:val="-2"/>
+                          <w:sz w:val="24"/>
+                          <w:szCs w:val="36"/>
+                        </w:rPr>
+                        <w:t>user_ask_role</w:t>
+                      </w:r>
+                      <w:proofErr w:type="spellEnd"/>
+                      <w:r>
+                        <w:rPr>
+                          <w:bCs/>
+                          <w:spacing w:val="-2"/>
+                          <w:sz w:val="24"/>
+                          <w:szCs w:val="36"/>
+                        </w:rPr>
+                        <w:t xml:space="preserve"> == ‘pla</w:t>
+                      </w:r>
+                      <w:r>
+                        <w:rPr>
+                          <w:bCs/>
+                          <w:spacing w:val="-2"/>
+                          <w:sz w:val="24"/>
+                          <w:szCs w:val="36"/>
+                        </w:rPr>
+                        <w:t>i</w:t>
+                      </w:r>
+                      <w:r>
+                        <w:rPr>
+                          <w:bCs/>
+                          <w:spacing w:val="-2"/>
+                          <w:sz w:val="24"/>
+                          <w:szCs w:val="36"/>
+                        </w:rPr>
+                        <w:t>ntiff</w:t>
+                      </w:r>
+                      <w:r>
+                        <w:rPr>
+                          <w:bCs/>
+                          <w:spacing w:val="-2"/>
+                          <w:sz w:val="24"/>
+                          <w:szCs w:val="36"/>
+                        </w:rPr>
+                        <w:t>’</w:t>
+                      </w:r>
+                      <w:r>
+                        <w:rPr>
+                          <w:bCs/>
+                          <w:spacing w:val="-2"/>
+                          <w:sz w:val="24"/>
+                          <w:szCs w:val="36"/>
+                        </w:rPr>
+                        <w:t xml:space="preserve"> </w:t>
+                      </w:r>
+                      <w:proofErr w:type="gramStart"/>
+                      <w:r>
+                        <w:rPr>
+                          <w:bCs/>
+                          <w:spacing w:val="-2"/>
+                          <w:sz w:val="24"/>
+                          <w:szCs w:val="36"/>
+                        </w:rPr>
+                        <w:t>%}</w:t>
+                      </w:r>
+                      <w:r>
+                        <w:rPr>
+                          <w:b/>
+                          <w:spacing w:val="-2"/>
+                          <w:sz w:val="24"/>
+                          <w:szCs w:val="36"/>
+                          <w:u w:val="single"/>
+                        </w:rPr>
+                        <w:t>{</w:t>
+                      </w:r>
+                      <w:proofErr w:type="gramEnd"/>
+                      <w:r>
+                        <w:rPr>
+                          <w:b/>
+                          <w:spacing w:val="-2"/>
+                          <w:sz w:val="24"/>
+                          <w:szCs w:val="36"/>
+                          <w:u w:val="single"/>
+                        </w:rPr>
+                        <w:t>{</w:t>
+                      </w:r>
+                      <w:r>
+                        <w:rPr>
+                          <w:b/>
+                          <w:spacing w:val="-2"/>
+                          <w:sz w:val="24"/>
+                          <w:szCs w:val="36"/>
+                          <w:u w:val="single"/>
+                        </w:rPr>
+                        <w:t xml:space="preserve"> </w:t>
+                      </w:r>
+                      <w:proofErr w:type="spellStart"/>
+                      <w:r>
+                        <w:rPr>
+                          <w:b/>
+                          <w:spacing w:val="-2"/>
+                          <w:sz w:val="24"/>
+                          <w:szCs w:val="36"/>
+                          <w:u w:val="single"/>
+                        </w:rPr>
+                        <w:t>us</w:t>
+                      </w:r>
+                      <w:r>
+                        <w:rPr>
+                          <w:b/>
+                          <w:spacing w:val="-2"/>
+                          <w:sz w:val="24"/>
+                          <w:szCs w:val="36"/>
+                          <w:u w:val="single"/>
+                        </w:rPr>
+                        <w:t>er</w:t>
+                      </w:r>
+                      <w:r>
+                        <w:rPr>
+                          <w:b/>
+                          <w:spacing w:val="-2"/>
+                          <w:sz w:val="24"/>
+                          <w:szCs w:val="36"/>
+                          <w:u w:val="single"/>
+                        </w:rPr>
+                        <w:t>_names</w:t>
+                      </w:r>
+                      <w:proofErr w:type="spellEnd"/>
+                      <w:r>
+                        <w:rPr>
+                          <w:b/>
+                          <w:spacing w:val="-2"/>
+                          <w:sz w:val="24"/>
+                          <w:szCs w:val="36"/>
+                          <w:u w:val="single"/>
+                        </w:rPr>
+                        <w:t>}}</w:t>
+                      </w:r>
+                      <w:r>
+                        <w:rPr>
+                          <w:bCs/>
+                          <w:spacing w:val="-2"/>
+                          <w:sz w:val="24"/>
+                          <w:szCs w:val="36"/>
+                        </w:rPr>
+                        <w:t>{% else %}</w:t>
+                      </w:r>
+                      <w:r>
+                        <w:rPr>
+                          <w:b/>
+                          <w:spacing w:val="-2"/>
+                          <w:sz w:val="24"/>
+                          <w:szCs w:val="36"/>
+                          <w:u w:val="single"/>
+                        </w:rPr>
+                        <w:t xml:space="preserve">{{ </w:t>
+                      </w:r>
+                      <w:proofErr w:type="spellStart"/>
+                      <w:r>
+                        <w:rPr>
+                          <w:b/>
+                          <w:spacing w:val="-2"/>
+                          <w:sz w:val="24"/>
+                          <w:szCs w:val="36"/>
+                          <w:u w:val="single"/>
+                        </w:rPr>
+                        <w:t>other_parties_names</w:t>
+                      </w:r>
+                      <w:proofErr w:type="spellEnd"/>
+                      <w:r>
+                        <w:rPr>
+                          <w:b/>
+                          <w:spacing w:val="-2"/>
+                          <w:sz w:val="24"/>
+                          <w:szCs w:val="36"/>
+                          <w:u w:val="single"/>
+                        </w:rPr>
+                        <w:t xml:space="preserve"> }}</w:t>
+                      </w:r>
+                      <w:r>
+                        <w:rPr>
+                          <w:bCs/>
+                          <w:spacing w:val="-2"/>
+                          <w:sz w:val="24"/>
+                          <w:szCs w:val="36"/>
+                        </w:rPr>
+                        <w:t xml:space="preserve">{% </w:t>
+                      </w:r>
+                      <w:r>
+                        <w:rPr>
+                          <w:bCs/>
+                          <w:spacing w:val="-2"/>
+                          <w:sz w:val="24"/>
+                          <w:szCs w:val="36"/>
+                        </w:rPr>
+                        <w:t>endif %}</w:t>
+                      </w:r>
+                    </w:p>
+                    <w:p>
+                      <w:pPr>
+                        <w:ind w:left="1662"/>
+                        <w:rPr>
+                          <w:b/>
+                          <w:spacing w:val="-2"/>
+                          <w:sz w:val="16"/>
+                        </w:rPr>
+                      </w:pPr>
+                    </w:p>
+                    <w:p>
+                      <w:pPr>
+                        <w:ind w:left="1662"/>
+                        <w:rPr>
+                          <w:b/>
+                          <w:spacing w:val="-2"/>
+                          <w:sz w:val="16"/>
+                        </w:rPr>
+                      </w:pPr>
+                      <w:r>
+                        <w:rPr>
+                          <w:b/>
+                          <w:spacing w:val="-2"/>
+                          <w:sz w:val="16"/>
+                        </w:rPr>
+                        <w:t>(</w:t>
+                      </w:r>
+                      <w:r>
+                        <w:rPr>
+                          <w:b/>
+                          <w:spacing w:val="-2"/>
+                          <w:sz w:val="13"/>
+                        </w:rPr>
+                        <w:t>PETITIONER</w:t>
+                      </w:r>
+                      <w:r>
+                        <w:rPr>
+                          <w:b/>
+                          <w:spacing w:val="-2"/>
+                          <w:sz w:val="16"/>
+                        </w:rPr>
+                        <w:t>)</w:t>
+                      </w:r>
+                    </w:p>
+                    <w:p>
+                      <w:pPr>
+                        <w:rPr>
+                          <w:b/>
+                          <w:spacing w:val="-2"/>
+                          <w:sz w:val="24"/>
+                        </w:rPr>
+                      </w:pPr>
+                      <w:r>
+                        <w:rPr>
+                          <w:b/>
+                          <w:spacing w:val="-2"/>
+                          <w:sz w:val="24"/>
+                        </w:rPr>
+                        <w:t>VERSUS</w:t>
+                      </w:r>
+                    </w:p>
+                    <w:p>
+                      <w:pPr>
+                        <w:rPr>
+                          <w:b/>
+                          <w:spacing w:val="-2"/>
+                          <w:sz w:val="24"/>
+                        </w:rPr>
+                      </w:pPr>
+                    </w:p>
+                    <w:p>
+                      <w:pPr>
+                        <w:rPr>
+                          <w:b/>
+                          <w:bCs/>
+                          <w:sz w:val="24"/>
+                          <w:szCs w:val="24"/>
+                          <w:u w:val="single"/>
+                        </w:rPr>
+                      </w:pPr>
+                      <w:r>
+                        <w:rPr>
+                          <w:bCs/>
+                          <w:spacing w:val="-2"/>
+                          <w:sz w:val="24"/>
+                          <w:szCs w:val="36"/>
+                        </w:rPr>
+                        <w:t xml:space="preserve">{% if </w:t>
+                      </w:r>
+                      <w:proofErr w:type="spellStart"/>
+                      <w:r>
+                        <w:rPr>
+                          <w:bCs/>
+                          <w:spacing w:val="-2"/>
+                          <w:sz w:val="24"/>
+                          <w:szCs w:val="36"/>
+                        </w:rPr>
+                        <w:t>user_ask_role</w:t>
+                      </w:r>
+                      <w:proofErr w:type="spellEnd"/>
+                      <w:r>
+                        <w:rPr>
+                          <w:bCs/>
+                          <w:spacing w:val="-2"/>
+                          <w:sz w:val="24"/>
+                          <w:szCs w:val="36"/>
+                        </w:rPr>
+                        <w:t xml:space="preserve"> == </w:t>
+                      </w:r>
+                      <w:r>
+                        <w:rPr>
+                          <w:bCs/>
+                          <w:spacing w:val="-2"/>
+                          <w:sz w:val="24"/>
+                          <w:szCs w:val="36"/>
+                        </w:rPr>
+                        <w:t>‘</w:t>
+                      </w:r>
+                      <w:r>
+                        <w:rPr>
+                          <w:bCs/>
+                          <w:spacing w:val="-2"/>
+                          <w:sz w:val="24"/>
+                          <w:szCs w:val="36"/>
+                        </w:rPr>
+                        <w:t>defendant’ %}</w:t>
+                      </w:r>
+                      <w:r>
+                        <w:rPr>
+                          <w:sz w:val="24"/>
+                          <w:szCs w:val="24"/>
+                        </w:rPr>
+                        <w:t xml:space="preserve"> </w:t>
+                      </w:r>
+                      <w:proofErr w:type="gramStart"/>
+                      <w:r>
+                        <w:rPr>
+                          <w:b/>
+                          <w:bCs/>
+                          <w:sz w:val="24"/>
+                          <w:szCs w:val="24"/>
+                          <w:u w:val="single"/>
+                        </w:rPr>
+                        <w:t>{{</w:t>
+                      </w:r>
+                      <w:r>
+                        <w:rPr>
+                          <w:b/>
+                          <w:bCs/>
+                          <w:sz w:val="24"/>
+                          <w:szCs w:val="24"/>
+                          <w:u w:val="single"/>
+                        </w:rPr>
+                        <w:t xml:space="preserve"> </w:t>
+                      </w:r>
+                      <w:proofErr w:type="spellStart"/>
+                      <w:r>
+                        <w:rPr>
+                          <w:b/>
+                          <w:bCs/>
+                          <w:sz w:val="24"/>
+                          <w:szCs w:val="24"/>
+                          <w:u w:val="single"/>
+                        </w:rPr>
+                        <w:t>user</w:t>
+                      </w:r>
+                      <w:proofErr w:type="gramEnd"/>
+                      <w:r>
+                        <w:rPr>
+                          <w:b/>
+                          <w:bCs/>
+                          <w:sz w:val="24"/>
+                          <w:szCs w:val="24"/>
+                          <w:u w:val="single"/>
+                        </w:rPr>
+                        <w:t>_names</w:t>
+                      </w:r>
+                      <w:proofErr w:type="spellEnd"/>
+                      <w:r>
+                        <w:rPr>
+                          <w:b/>
+                          <w:bCs/>
+                          <w:sz w:val="24"/>
+                          <w:szCs w:val="24"/>
+                          <w:u w:val="single"/>
+                        </w:rPr>
+                        <w:t xml:space="preserve"> }}</w:t>
+                      </w:r>
+                    </w:p>
+                    <w:p>
+                      <w:pPr>
+                        <w:rPr>
+                          <w:sz w:val="24"/>
+                          <w:szCs w:val="24"/>
+                        </w:rPr>
+                      </w:pPr>
+                      <w:r>
+                        <w:rPr>
+                          <w:bCs/>
+                          <w:spacing w:val="-2"/>
+                          <w:sz w:val="24"/>
+                          <w:szCs w:val="36"/>
+                        </w:rPr>
+                        <w:t xml:space="preserve">{% else </w:t>
+                      </w:r>
+                      <w:proofErr w:type="gramStart"/>
+                      <w:r>
+                        <w:rPr>
+                          <w:bCs/>
+                          <w:spacing w:val="-2"/>
+                          <w:sz w:val="24"/>
+                          <w:szCs w:val="36"/>
+                        </w:rPr>
+                        <w:t>%}</w:t>
+                      </w:r>
+                      <w:r>
+                        <w:rPr>
+                          <w:b/>
+                          <w:spacing w:val="-2"/>
+                          <w:sz w:val="24"/>
+                          <w:szCs w:val="36"/>
+                          <w:u w:val="single"/>
+                        </w:rPr>
+                        <w:t>{</w:t>
+                      </w:r>
+                      <w:proofErr w:type="gramEnd"/>
+                      <w:r>
+                        <w:rPr>
+                          <w:b/>
+                          <w:spacing w:val="-2"/>
+                          <w:sz w:val="24"/>
+                          <w:szCs w:val="36"/>
+                          <w:u w:val="single"/>
+                        </w:rPr>
+                        <w:t xml:space="preserve">{ </w:t>
+                      </w:r>
+                      <w:proofErr w:type="spellStart"/>
+                      <w:r>
+                        <w:rPr>
+                          <w:b/>
+                          <w:spacing w:val="-2"/>
+                          <w:sz w:val="24"/>
+                          <w:szCs w:val="36"/>
+                          <w:u w:val="single"/>
+                        </w:rPr>
+                        <w:t>other_parties</w:t>
+                      </w:r>
+                      <w:r>
+                        <w:rPr>
+                          <w:b/>
+                          <w:spacing w:val="-2"/>
+                          <w:sz w:val="24"/>
+                          <w:szCs w:val="36"/>
+                          <w:u w:val="single"/>
+                        </w:rPr>
+                        <w:t>_names</w:t>
+                      </w:r>
+                      <w:proofErr w:type="spellEnd"/>
+                      <w:r>
+                        <w:rPr>
+                          <w:b/>
+                          <w:spacing w:val="-2"/>
+                          <w:sz w:val="24"/>
+                          <w:szCs w:val="36"/>
+                          <w:u w:val="single"/>
+                        </w:rPr>
+                        <w:t xml:space="preserve"> }}</w:t>
+                      </w:r>
+                      <w:r>
+                        <w:rPr>
+                          <w:bCs/>
+                          <w:spacing w:val="-2"/>
+                          <w:sz w:val="24"/>
+                          <w:szCs w:val="36"/>
+                        </w:rPr>
+                        <w:t xml:space="preserve">{% </w:t>
+                      </w:r>
+                      <w:r>
+                        <w:rPr>
+                          <w:bCs/>
+                          <w:spacing w:val="-2"/>
+                          <w:sz w:val="24"/>
+                          <w:szCs w:val="36"/>
+                        </w:rPr>
+                        <w:t>endif %}</w:t>
+                      </w:r>
+                    </w:p>
+                    <w:p>
+                      <w:pPr>
+                        <w:spacing w:line="183" w:lineRule="exact"/>
+                        <w:ind w:left="1713"/>
+                        <w:rPr>
+                          <w:b/>
+                          <w:sz w:val="16"/>
+                        </w:rPr>
+                      </w:pPr>
+                      <w:r>
+                        <w:rPr>
+                          <w:b/>
+                          <w:spacing w:val="-2"/>
+                          <w:sz w:val="13"/>
+                        </w:rPr>
+                        <w:t>(DEFENDANT</w:t>
+                      </w:r>
+                      <w:r>
+                        <w:rPr>
+                          <w:b/>
+                          <w:spacing w:val="-2"/>
+                          <w:sz w:val="16"/>
+                        </w:rPr>
+                        <w:t>)</w:t>
+                      </w:r>
+                    </w:p>
+                    <w:p>
+                      <w:pPr>
+                        <w:rPr>
+                          <w:b/>
+                          <w:sz w:val="16"/>
+                        </w:rPr>
+                      </w:pPr>
+                    </w:p>
+                  </w:txbxContent>
+                </v:textbox>
+                <w10:wrap type="square"/>
+              </v:shape>
+            </w:pict>
+          </mc:Fallback>
+        </mc:AlternateContent>
+      </w:r>
+      <w:r>
+        <w:rPr>
+          <w:noProof/>
+        </w:rPr>
+        <mc:AlternateContent>
+          <mc:Choice Requires="wps">
+            <w:drawing>
+              <wp:anchor distT="45720" distB="45720" distL="114300" distR="114300" simplePos="0" relativeHeight="251658240" behindDoc="0" locked="0" layoutInCell="1" allowOverlap="1" wp14:anchorId="028CBD92" wp14:editId="4B01665E">
                 <wp:simplePos x="0" y="0"/>
                 <wp:positionH relativeFrom="column">
                   <wp:posOffset>2723515</wp:posOffset>
@@ -1840,6 +3032,7 @@
                               <w:spacing w:after="240" w:line="360" w:lineRule="auto"/>
                               <w:textDirection w:val="btLr"/>
                             </w:pPr>
+                            <w:proofErr w:type="gramStart"/>
                             <w:r>
                               <w:rPr>
                                 <w:b/>
@@ -1857,7 +3050,17 @@
                                 <w:sz w:val="24"/>
                                 <w:u w:val="single"/>
                               </w:rPr>
-                              <w:t>judicial_district</w:t>
+                              <w:t>judicial</w:t>
+                            </w:r>
+                            <w:proofErr w:type="gramEnd"/>
+                            <w:r>
+                              <w:rPr>
+                                <w:b/>
+                                <w:color w:val="000000"/>
+                                <w:sz w:val="24"/>
+                                <w:u w:val="single"/>
+                              </w:rPr>
+                              <w:t>_district</w:t>
                             </w:r>
                             <w:proofErr w:type="spellEnd"/>
                             <w:r>
@@ -1891,6 +3094,7 @@
                               </w:rPr>
                               <w:t xml:space="preserve">DOCKET NO: </w:t>
                             </w:r>
+                            <w:proofErr w:type="gramStart"/>
                             <w:r>
                               <w:rPr>
                                 <w:b/>
@@ -1908,7 +3112,17 @@
                                 <w:sz w:val="24"/>
                                 <w:u w:val="single"/>
                               </w:rPr>
-                              <w:t>docket_number</w:t>
+                              <w:t>docket</w:t>
+                            </w:r>
+                            <w:proofErr w:type="gramEnd"/>
+                            <w:r>
+                              <w:rPr>
+                                <w:b/>
+                                <w:color w:val="000000"/>
+                                <w:sz w:val="24"/>
+                                <w:u w:val="single"/>
+                              </w:rPr>
+                              <w:t>_number</w:t>
                             </w:r>
                             <w:proofErr w:type="spellEnd"/>
                             <w:r>
@@ -1948,6 +3162,7 @@
                                 <w:sz w:val="24"/>
                               </w:rPr>
                             </w:pPr>
+                            <w:proofErr w:type="gramStart"/>
                             <w:r>
                               <w:rPr>
                                 <w:b/>
@@ -1955,7 +3170,17 @@
                                 <w:sz w:val="24"/>
                                 <w:u w:val="single"/>
                               </w:rPr>
-                              <w:t>{{ name }}</w:t>
+                              <w:t>{{ name</w:t>
+                            </w:r>
+                            <w:proofErr w:type="gramEnd"/>
+                            <w:r>
+                              <w:rPr>
+                                <w:b/>
+                                <w:color w:val="000000"/>
+                                <w:sz w:val="24"/>
+                                <w:u w:val="single"/>
+                              </w:rPr>
+                              <w:t xml:space="preserve"> }}</w:t>
                             </w:r>
                             <w:r>
                               <w:rPr>
@@ -2017,11 +3242,7 @@
           </mc:Choice>
           <mc:Fallback>
             <w:pict>
-              <v:shapetype w14:anchorId="028CBD92" id="_x0000_t202" coordsize="21600,21600" o:spt="202" path="m,l,21600r21600,l21600,xe">
-                <v:stroke joinstyle="miter"/>
-                <v:path gradientshapeok="t" o:connecttype="rect"/>
-              </v:shapetype>
-              <v:shape id="Text Box 2" o:spid="_x0000_s1026" type="#_x0000_t202" style="position:absolute;margin-left:214.45pt;margin-top:4.3pt;width:254.3pt;height:162.7pt;z-index:251659264;visibility:visible;mso-wrap-style:square;mso-width-percent:0;mso-height-percent:0;mso-wrap-distance-left:9pt;mso-wrap-distance-top:3.6pt;mso-wrap-distance-right:9pt;mso-wrap-distance-bottom:3.6pt;mso-position-horizontal:absolute;mso-position-horizontal-relative:text;mso-position-vertical:absolute;mso-position-vertical-relative:text;mso-width-percent:0;mso-height-percent:0;mso-width-relative:margin;mso-height-relative:margin;v-text-anchor:top" o:gfxdata="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" stroked="f">
+              <v:shape w14:anchorId="028CBD92" id="_x0000_s1027" type="#_x0000_t202" style="position:absolute;margin-left:214.45pt;margin-top:4.3pt;width:254.3pt;height:162.7pt;z-index:251658240;visibility:visible;mso-wrap-style:square;mso-width-percent:0;mso-height-percent:0;mso-wrap-distance-left:9pt;mso-wrap-distance-top:3.6pt;mso-wrap-distance-right:9pt;mso-wrap-distance-bottom:3.6pt;mso-position-horizontal:absolute;mso-position-horizontal-relative:text;mso-position-vertical:absolute;mso-position-vertical-relative:text;mso-width-percent:0;mso-height-percent:0;mso-width-relative:margin;mso-height-relative:margin;v-text-anchor:top" o:gfxdata="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" stroked="f">
                 <v:textbox>
                   <w:txbxContent>
                     <w:p>
@@ -2029,6 +3250,7 @@
                         <w:spacing w:after="240" w:line="360" w:lineRule="auto"/>
                         <w:textDirection w:val="btLr"/>
                       </w:pPr>
+                      <w:proofErr w:type="gramStart"/>
                       <w:r>
                         <w:rPr>
                           <w:b/>
@@ -2046,7 +3268,17 @@
                           <w:sz w:val="24"/>
                           <w:u w:val="single"/>
                         </w:rPr>
-                        <w:t>judicial_district</w:t>
+                        <w:t>judicial</w:t>
+                      </w:r>
+                      <w:proofErr w:type="gramEnd"/>
+                      <w:r>
+                        <w:rPr>
+                          <w:b/>
+                          <w:color w:val="000000"/>
+                          <w:sz w:val="24"/>
+                          <w:u w:val="single"/>
+                        </w:rPr>
+                        <w:t>_district</w:t>
                       </w:r>
                       <w:proofErr w:type="spellEnd"/>
                       <w:r>
@@ -2080,6 +3312,7 @@
                         </w:rPr>
                         <w:t xml:space="preserve">DOCKET NO: </w:t>
                       </w:r>
+                      <w:proofErr w:type="gramStart"/>
                       <w:r>
                         <w:rPr>
                           <w:b/>
@@ -2097,7 +3330,17 @@
                           <w:sz w:val="24"/>
                           <w:u w:val="single"/>
                         </w:rPr>
-                        <w:t>docket_number</w:t>
+                        <w:t>docket</w:t>
+                      </w:r>
+                      <w:proofErr w:type="gramEnd"/>
+                      <w:r>
+                        <w:rPr>
+                          <w:b/>
+                          <w:color w:val="000000"/>
+                          <w:sz w:val="24"/>
+                          <w:u w:val="single"/>
+                        </w:rPr>
+                        <w:t>_number</w:t>
                       </w:r>
                       <w:proofErr w:type="spellEnd"/>
                       <w:r>
@@ -2137,6 +3380,7 @@
                           <w:sz w:val="24"/>
                         </w:rPr>
                       </w:pPr>
+                      <w:proofErr w:type="gramStart"/>
                       <w:r>
                         <w:rPr>
                           <w:b/>
@@ -2144,7 +3388,17 @@
                           <w:sz w:val="24"/>
                           <w:u w:val="single"/>
                         </w:rPr>
-                        <w:t>{{ name }}</w:t>
+                        <w:t>{{ name</w:t>
+                      </w:r>
+                      <w:proofErr w:type="gramEnd"/>
+                      <w:r>
+                        <w:rPr>
+                          <w:b/>
+                          <w:color w:val="000000"/>
+                          <w:sz w:val="24"/>
+                          <w:u w:val="single"/>
+                        </w:rPr>
+                        <w:t xml:space="preserve"> }}</w:t>
                       </w:r>
                       <w:r>
                         <w:rPr>
@@ -2195,1006 +3449,6 @@
           </mc:Fallback>
         </mc:AlternateContent>
       </w:r>
-      <w:r>
-        <w:rPr>
-          <w:b w:val="0"/>
-          <w:noProof/>
-          <w:szCs w:val="44"/>
-        </w:rPr>
-        <mc:AlternateContent>
-          <mc:Choice Requires="wps">
-            <w:drawing>
-              <wp:anchor distT="45720" distB="45720" distL="114300" distR="114300" simplePos="0" relativeHeight="251657216" behindDoc="0" locked="0" layoutInCell="1" allowOverlap="1" wp14:anchorId="29946CE2" wp14:editId="75731E6B">
-                <wp:simplePos x="0" y="0"/>
-                <wp:positionH relativeFrom="column">
-                  <wp:posOffset>-245745</wp:posOffset>
-                </wp:positionH>
-                <wp:positionV relativeFrom="paragraph">
-                  <wp:posOffset>-5080</wp:posOffset>
-                </wp:positionV>
-                <wp:extent cx="2360930" cy="2719070"/>
-                <wp:effectExtent l="0" t="0" r="0" b="5080"/>
-                <wp:wrapSquare wrapText="bothSides"/>
-                <wp:docPr id="217" name="Text Box 2"/>
-                <wp:cNvGraphicFramePr>
-                  <a:graphicFrameLocks xmlns:a="http://schemas.openxmlformats.org/drawingml/2006/main"/>
-                </wp:cNvGraphicFramePr>
-                <a:graphic xmlns:a="http://schemas.openxmlformats.org/drawingml/2006/main">
-                  <a:graphicData uri="http://schemas.microsoft.com/office/word/2010/wordprocessingShape">
-                    <wps:wsp>
-                      <wps:cNvSpPr txBox="1">
-                        <a:spLocks noChangeArrowheads="1"/>
-                      </wps:cNvSpPr>
-                      <wps:spPr bwMode="auto">
-                        <a:xfrm>
-                          <a:off x="0" y="0"/>
-                          <a:ext cx="2360930" cy="2719070"/>
-                        </a:xfrm>
-                        <a:prstGeom prst="rect">
-                          <a:avLst/>
-                        </a:prstGeom>
-                        <a:solidFill>
-                          <a:srgbClr val="FFFFFF"/>
-                        </a:solidFill>
-                        <a:ln w="9525">
-                          <a:noFill/>
-                          <a:miter lim="800000"/>
-                          <a:headEnd/>
-                          <a:tailEnd/>
-                        </a:ln>
-                      </wps:spPr>
-                      <wps:txbx>
-                        <w:txbxContent>
-                          <w:p>
-                            <w:pPr>
-                              <w:spacing w:before="143"/>
-                              <w:rPr>
-                                <w:bCs/>
-                                <w:spacing w:val="-2"/>
-                                <w:sz w:val="24"/>
-                                <w:szCs w:val="36"/>
-                              </w:rPr>
-                            </w:pPr>
-                            <w:r>
-                              <w:rPr>
-                                <w:bCs/>
-                                <w:spacing w:val="-2"/>
-                                <w:sz w:val="24"/>
-                                <w:szCs w:val="36"/>
-                              </w:rPr>
-                              <w:t xml:space="preserve">{% if </w:t>
-                            </w:r>
-                            <w:proofErr w:type="spellStart"/>
-                            <w:r>
-                              <w:rPr>
-                                <w:bCs/>
-                                <w:spacing w:val="-2"/>
-                                <w:sz w:val="24"/>
-                                <w:szCs w:val="36"/>
-                              </w:rPr>
-                              <w:t>user_ask_role</w:t>
-                            </w:r>
-                            <w:proofErr w:type="spellEnd"/>
-                            <w:r>
-                              <w:rPr>
-                                <w:bCs/>
-                                <w:spacing w:val="-2"/>
-                                <w:sz w:val="24"/>
-                                <w:szCs w:val="36"/>
-                              </w:rPr>
-                              <w:t xml:space="preserve"> == ‘pla</w:t>
-                            </w:r>
-                            <w:r>
-                              <w:rPr>
-                                <w:bCs/>
-                                <w:spacing w:val="-2"/>
-                                <w:sz w:val="24"/>
-                                <w:szCs w:val="36"/>
-                              </w:rPr>
-                              <w:t>i</w:t>
-                            </w:r>
-                            <w:r>
-                              <w:rPr>
-                                <w:bCs/>
-                                <w:spacing w:val="-2"/>
-                                <w:sz w:val="24"/>
-                                <w:szCs w:val="36"/>
-                              </w:rPr>
-                              <w:t>ntiff</w:t>
-                            </w:r>
-                            <w:r>
-                              <w:rPr>
-                                <w:bCs/>
-                                <w:spacing w:val="-2"/>
-                                <w:sz w:val="24"/>
-                                <w:szCs w:val="36"/>
-                              </w:rPr>
-                              <w:t>’</w:t>
-                            </w:r>
-                            <w:r>
-                              <w:rPr>
-                                <w:bCs/>
-                                <w:spacing w:val="-2"/>
-                                <w:sz w:val="24"/>
-                                <w:szCs w:val="36"/>
-                              </w:rPr>
-                              <w:t xml:space="preserve"> %}</w:t>
-                            </w:r>
-                            <w:r>
-                              <w:rPr>
-                                <w:b/>
-                                <w:spacing w:val="-2"/>
-                                <w:sz w:val="24"/>
-                                <w:szCs w:val="36"/>
-                                <w:u w:val="single"/>
-                              </w:rPr>
-                              <w:t>{{</w:t>
-                            </w:r>
-                            <w:r>
-                              <w:rPr>
-                                <w:b/>
-                                <w:spacing w:val="-2"/>
-                                <w:sz w:val="24"/>
-                                <w:szCs w:val="36"/>
-                                <w:u w:val="single"/>
-                              </w:rPr>
-                              <w:t xml:space="preserve"> </w:t>
-                            </w:r>
-                            <w:proofErr w:type="spellStart"/>
-                            <w:r>
-                              <w:rPr>
-                                <w:b/>
-                                <w:spacing w:val="-2"/>
-                                <w:sz w:val="24"/>
-                                <w:szCs w:val="36"/>
-                                <w:u w:val="single"/>
-                              </w:rPr>
-                              <w:t>us</w:t>
-                            </w:r>
-                            <w:r>
-                              <w:rPr>
-                                <w:b/>
-                                <w:spacing w:val="-2"/>
-                                <w:sz w:val="24"/>
-                                <w:szCs w:val="36"/>
-                                <w:u w:val="single"/>
-                              </w:rPr>
-                              <w:t>ers.name.full</w:t>
-                            </w:r>
-                            <w:proofErr w:type="spellEnd"/>
-                            <w:r>
-                              <w:rPr>
-                                <w:b/>
-                                <w:spacing w:val="-2"/>
-                                <w:sz w:val="24"/>
-                                <w:szCs w:val="36"/>
-                                <w:u w:val="single"/>
-                              </w:rPr>
-                              <w:t>() }}</w:t>
-                            </w:r>
-                            <w:r>
-                              <w:rPr>
-                                <w:bCs/>
-                                <w:spacing w:val="-2"/>
-                                <w:sz w:val="24"/>
-                                <w:szCs w:val="36"/>
-                              </w:rPr>
-                              <w:t>{% else %}</w:t>
-                            </w:r>
-                            <w:r>
-                              <w:rPr>
-                                <w:b/>
-                                <w:spacing w:val="-2"/>
-                                <w:sz w:val="24"/>
-                                <w:szCs w:val="36"/>
-                                <w:u w:val="single"/>
-                              </w:rPr>
-                              <w:t xml:space="preserve">{{ </w:t>
-                            </w:r>
-                            <w:proofErr w:type="spellStart"/>
-                            <w:r>
-                              <w:rPr>
-                                <w:b/>
-                                <w:spacing w:val="-2"/>
-                                <w:sz w:val="24"/>
-                                <w:szCs w:val="36"/>
-                                <w:u w:val="single"/>
-                              </w:rPr>
-                              <w:t>other_parties.name.full</w:t>
-                            </w:r>
-                            <w:proofErr w:type="spellEnd"/>
-                            <w:r>
-                              <w:rPr>
-                                <w:b/>
-                                <w:spacing w:val="-2"/>
-                                <w:sz w:val="24"/>
-                                <w:szCs w:val="36"/>
-                                <w:u w:val="single"/>
-                              </w:rPr>
-                              <w:t>() }}</w:t>
-                            </w:r>
-                            <w:r>
-                              <w:rPr>
-                                <w:bCs/>
-                                <w:spacing w:val="-2"/>
-                                <w:sz w:val="24"/>
-                                <w:szCs w:val="36"/>
-                              </w:rPr>
-                              <w:t xml:space="preserve">{% </w:t>
-                            </w:r>
-                            <w:r>
-                              <w:rPr>
-                                <w:bCs/>
-                                <w:spacing w:val="-2"/>
-                                <w:sz w:val="24"/>
-                                <w:szCs w:val="36"/>
-                              </w:rPr>
-                              <w:t>endif %}</w:t>
-                            </w:r>
-                          </w:p>
-                          <w:p>
-                            <w:pPr>
-                              <w:ind w:left="1662"/>
-                              <w:rPr>
-                                <w:b/>
-                                <w:spacing w:val="-2"/>
-                                <w:sz w:val="16"/>
-                              </w:rPr>
-                            </w:pPr>
-                          </w:p>
-                          <w:p>
-                            <w:pPr>
-                              <w:ind w:left="1662"/>
-                              <w:rPr>
-                                <w:b/>
-                                <w:spacing w:val="-2"/>
-                                <w:sz w:val="16"/>
-                              </w:rPr>
-                            </w:pPr>
-                            <w:r>
-                              <w:rPr>
-                                <w:b/>
-                                <w:spacing w:val="-2"/>
-                                <w:sz w:val="16"/>
-                              </w:rPr>
-                              <w:t>(</w:t>
-                            </w:r>
-                            <w:r>
-                              <w:rPr>
-                                <w:b/>
-                                <w:spacing w:val="-2"/>
-                                <w:sz w:val="13"/>
-                              </w:rPr>
-                              <w:t>PETITIONER</w:t>
-                            </w:r>
-                            <w:r>
-                              <w:rPr>
-                                <w:b/>
-                                <w:spacing w:val="-2"/>
-                                <w:sz w:val="16"/>
-                              </w:rPr>
-                              <w:t>)</w:t>
-                            </w:r>
-                          </w:p>
-                          <w:p>
-                            <w:pPr>
-                              <w:rPr>
-                                <w:b/>
-                                <w:spacing w:val="-2"/>
-                                <w:sz w:val="24"/>
-                              </w:rPr>
-                            </w:pPr>
-                            <w:r>
-                              <w:rPr>
-                                <w:b/>
-                                <w:spacing w:val="-2"/>
-                                <w:sz w:val="24"/>
-                              </w:rPr>
-                              <w:t>VERSUS</w:t>
-                            </w:r>
-                          </w:p>
-                          <w:p>
-                            <w:pPr>
-                              <w:rPr>
-                                <w:b/>
-                                <w:spacing w:val="-2"/>
-                                <w:sz w:val="24"/>
-                              </w:rPr>
-                            </w:pPr>
-                          </w:p>
-                          <w:p>
-                            <w:pPr>
-                              <w:spacing w:before="143"/>
-                              <w:rPr>
-                                <w:bCs/>
-                                <w:spacing w:val="-2"/>
-                                <w:sz w:val="24"/>
-                                <w:szCs w:val="36"/>
-                              </w:rPr>
-                            </w:pPr>
-                            <w:r>
-                              <w:rPr>
-                                <w:bCs/>
-                                <w:spacing w:val="-2"/>
-                                <w:sz w:val="24"/>
-                                <w:szCs w:val="36"/>
-                              </w:rPr>
-                              <w:t xml:space="preserve">{% if </w:t>
-                            </w:r>
-                            <w:proofErr w:type="spellStart"/>
-                            <w:r>
-                              <w:rPr>
-                                <w:bCs/>
-                                <w:spacing w:val="-2"/>
-                                <w:sz w:val="24"/>
-                                <w:szCs w:val="36"/>
-                              </w:rPr>
-                              <w:t>user_ask_role</w:t>
-                            </w:r>
-                            <w:proofErr w:type="spellEnd"/>
-                            <w:r>
-                              <w:rPr>
-                                <w:bCs/>
-                                <w:spacing w:val="-2"/>
-                                <w:sz w:val="24"/>
-                                <w:szCs w:val="36"/>
-                              </w:rPr>
-                              <w:t xml:space="preserve"> == </w:t>
-                            </w:r>
-                            <w:r>
-                              <w:rPr>
-                                <w:bCs/>
-                                <w:spacing w:val="-2"/>
-                                <w:sz w:val="24"/>
-                                <w:szCs w:val="36"/>
-                              </w:rPr>
-                              <w:t>‘</w:t>
-                            </w:r>
-                            <w:r>
-                              <w:rPr>
-                                <w:bCs/>
-                                <w:spacing w:val="-2"/>
-                                <w:sz w:val="24"/>
-                                <w:szCs w:val="36"/>
-                              </w:rPr>
-                              <w:t>defendant’ %}</w:t>
-                            </w:r>
-                            <w:r>
-                              <w:rPr>
-                                <w:b/>
-                                <w:spacing w:val="-2"/>
-                                <w:sz w:val="24"/>
-                                <w:szCs w:val="36"/>
-                                <w:u w:val="single"/>
-                              </w:rPr>
-                              <w:t xml:space="preserve">{{ </w:t>
-                            </w:r>
-                            <w:proofErr w:type="spellStart"/>
-                            <w:r>
-                              <w:rPr>
-                                <w:b/>
-                                <w:spacing w:val="-2"/>
-                                <w:sz w:val="24"/>
-                                <w:szCs w:val="36"/>
-                                <w:u w:val="single"/>
-                              </w:rPr>
-                              <w:t>us</w:t>
-                            </w:r>
-                            <w:r>
-                              <w:rPr>
-                                <w:b/>
-                                <w:spacing w:val="-2"/>
-                                <w:sz w:val="24"/>
-                                <w:szCs w:val="36"/>
-                                <w:u w:val="single"/>
-                              </w:rPr>
-                              <w:t>ers</w:t>
-                            </w:r>
-                            <w:r>
-                              <w:rPr>
-                                <w:b/>
-                                <w:spacing w:val="-2"/>
-                                <w:sz w:val="24"/>
-                                <w:szCs w:val="36"/>
-                                <w:u w:val="single"/>
-                              </w:rPr>
-                              <w:t>.name.full</w:t>
-                            </w:r>
-                            <w:proofErr w:type="spellEnd"/>
-                            <w:r>
-                              <w:rPr>
-                                <w:b/>
-                                <w:spacing w:val="-2"/>
-                                <w:sz w:val="24"/>
-                                <w:szCs w:val="36"/>
-                                <w:u w:val="single"/>
-                              </w:rPr>
-                              <w:t>() }}</w:t>
-                            </w:r>
-                            <w:r>
-                              <w:rPr>
-                                <w:bCs/>
-                                <w:spacing w:val="-2"/>
-                                <w:sz w:val="24"/>
-                                <w:szCs w:val="36"/>
-                              </w:rPr>
-                              <w:t>{% else %}</w:t>
-                            </w:r>
-                            <w:r>
-                              <w:rPr>
-                                <w:b/>
-                                <w:spacing w:val="-2"/>
-                                <w:sz w:val="24"/>
-                                <w:szCs w:val="36"/>
-                                <w:u w:val="single"/>
-                              </w:rPr>
-                              <w:t xml:space="preserve">{{ </w:t>
-                            </w:r>
-                            <w:proofErr w:type="spellStart"/>
-                            <w:r>
-                              <w:rPr>
-                                <w:b/>
-                                <w:spacing w:val="-2"/>
-                                <w:sz w:val="24"/>
-                                <w:szCs w:val="36"/>
-                                <w:u w:val="single"/>
-                              </w:rPr>
-                              <w:t>other_parties.name.full</w:t>
-                            </w:r>
-                            <w:proofErr w:type="spellEnd"/>
-                            <w:r>
-                              <w:rPr>
-                                <w:b/>
-                                <w:spacing w:val="-2"/>
-                                <w:sz w:val="24"/>
-                                <w:szCs w:val="36"/>
-                                <w:u w:val="single"/>
-                              </w:rPr>
-                              <w:t>() }}</w:t>
-                            </w:r>
-                            <w:r>
-                              <w:rPr>
-                                <w:bCs/>
-                                <w:spacing w:val="-2"/>
-                                <w:sz w:val="24"/>
-                                <w:szCs w:val="36"/>
-                              </w:rPr>
-                              <w:t xml:space="preserve">{% </w:t>
-                            </w:r>
-                            <w:r>
-                              <w:rPr>
-                                <w:bCs/>
-                                <w:spacing w:val="-2"/>
-                                <w:sz w:val="24"/>
-                                <w:szCs w:val="36"/>
-                              </w:rPr>
-                              <w:t>endif %}</w:t>
-                            </w:r>
-                          </w:p>
-                          <w:p>
-                            <w:pPr>
-                              <w:spacing w:line="183" w:lineRule="exact"/>
-                              <w:ind w:left="1713"/>
-                              <w:rPr>
-                                <w:b/>
-                                <w:sz w:val="16"/>
-                              </w:rPr>
-                            </w:pPr>
-                            <w:r>
-                              <w:rPr>
-                                <w:b/>
-                                <w:spacing w:val="-2"/>
-                                <w:sz w:val="13"/>
-                              </w:rPr>
-                              <w:t>(DEFENDANT</w:t>
-                            </w:r>
-                            <w:r>
-                              <w:rPr>
-                                <w:b/>
-                                <w:spacing w:val="-2"/>
-                                <w:sz w:val="16"/>
-                              </w:rPr>
-                              <w:t>)</w:t>
-                            </w:r>
-                          </w:p>
-                          <w:p>
-                            <w:pPr>
-                              <w:rPr>
-                                <w:b/>
-                                <w:sz w:val="16"/>
-                              </w:rPr>
-                            </w:pPr>
-                          </w:p>
-                        </w:txbxContent>
-                      </wps:txbx>
-                      <wps:bodyPr rot="0" vert="horz" wrap="square" lIns="91440" tIns="45720" rIns="91440" bIns="45720" anchor="t" anchorCtr="0">
-                        <a:noAutofit/>
-                      </wps:bodyPr>
-                    </wps:wsp>
-                  </a:graphicData>
-                </a:graphic>
-                <wp14:sizeRelH relativeFrom="margin">
-                  <wp14:pctWidth>40000</wp14:pctWidth>
-                </wp14:sizeRelH>
-                <wp14:sizeRelV relativeFrom="margin">
-                  <wp14:pctHeight>0</wp14:pctHeight>
-                </wp14:sizeRelV>
-              </wp:anchor>
-            </w:drawing>
-          </mc:Choice>
-          <mc:Fallback>
-            <w:pict>
-              <v:shape w14:anchorId="29946CE2" id="_x0000_s1027" type="#_x0000_t202" style="position:absolute;margin-left:-19.35pt;margin-top:-.4pt;width:185.9pt;height:214.1pt;z-index:251657216;visibility:visible;mso-wrap-style:square;mso-width-percent:400;mso-height-percent:0;mso-wrap-distance-left:9pt;mso-wrap-distance-top:3.6pt;mso-wrap-distance-right:9pt;mso-wrap-distance-bottom:3.6pt;mso-position-horizontal:absolute;mso-position-horizontal-relative:text;mso-position-vertical:absolute;mso-position-vertical-relative:text;mso-width-percent:400;mso-height-percent:0;mso-width-relative:margin;mso-height-relative:margin;v-text-anchor:top" o:gfxdata="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" stroked="f">
-                <v:textbox>
-                  <w:txbxContent>
-                    <w:p>
-                      <w:pPr>
-                        <w:spacing w:before="143"/>
-                        <w:rPr>
-                          <w:bCs/>
-                          <w:spacing w:val="-2"/>
-                          <w:sz w:val="24"/>
-                          <w:szCs w:val="36"/>
-                        </w:rPr>
-                      </w:pPr>
-                      <w:r>
-                        <w:rPr>
-                          <w:bCs/>
-                          <w:spacing w:val="-2"/>
-                          <w:sz w:val="24"/>
-                          <w:szCs w:val="36"/>
-                        </w:rPr>
-                        <w:t xml:space="preserve">{% if </w:t>
-                      </w:r>
-                      <w:proofErr w:type="spellStart"/>
-                      <w:r>
-                        <w:rPr>
-                          <w:bCs/>
-                          <w:spacing w:val="-2"/>
-                          <w:sz w:val="24"/>
-                          <w:szCs w:val="36"/>
-                        </w:rPr>
-                        <w:t>user_ask_role</w:t>
-                      </w:r>
-                      <w:proofErr w:type="spellEnd"/>
-                      <w:r>
-                        <w:rPr>
-                          <w:bCs/>
-                          <w:spacing w:val="-2"/>
-                          <w:sz w:val="24"/>
-                          <w:szCs w:val="36"/>
-                        </w:rPr>
-                        <w:t xml:space="preserve"> == ‘pla</w:t>
-                      </w:r>
-                      <w:r>
-                        <w:rPr>
-                          <w:bCs/>
-                          <w:spacing w:val="-2"/>
-                          <w:sz w:val="24"/>
-                          <w:szCs w:val="36"/>
-                        </w:rPr>
-                        <w:t>i</w:t>
-                      </w:r>
-                      <w:r>
-                        <w:rPr>
-                          <w:bCs/>
-                          <w:spacing w:val="-2"/>
-                          <w:sz w:val="24"/>
-                          <w:szCs w:val="36"/>
-                        </w:rPr>
-                        <w:t>ntiff</w:t>
-                      </w:r>
-                      <w:r>
-                        <w:rPr>
-                          <w:bCs/>
-                          <w:spacing w:val="-2"/>
-                          <w:sz w:val="24"/>
-                          <w:szCs w:val="36"/>
-                        </w:rPr>
-                        <w:t>’</w:t>
-                      </w:r>
-                      <w:r>
-                        <w:rPr>
-                          <w:bCs/>
-                          <w:spacing w:val="-2"/>
-                          <w:sz w:val="24"/>
-                          <w:szCs w:val="36"/>
-                        </w:rPr>
-                        <w:t xml:space="preserve"> %}</w:t>
-                      </w:r>
-                      <w:r>
-                        <w:rPr>
-                          <w:b/>
-                          <w:spacing w:val="-2"/>
-                          <w:sz w:val="24"/>
-                          <w:szCs w:val="36"/>
-                          <w:u w:val="single"/>
-                        </w:rPr>
-                        <w:t>{{</w:t>
-                      </w:r>
-                      <w:r>
-                        <w:rPr>
-                          <w:b/>
-                          <w:spacing w:val="-2"/>
-                          <w:sz w:val="24"/>
-                          <w:szCs w:val="36"/>
-                          <w:u w:val="single"/>
-                        </w:rPr>
-                        <w:t xml:space="preserve"> </w:t>
-                      </w:r>
-                      <w:proofErr w:type="spellStart"/>
-                      <w:r>
-                        <w:rPr>
-                          <w:b/>
-                          <w:spacing w:val="-2"/>
-                          <w:sz w:val="24"/>
-                          <w:szCs w:val="36"/>
-                          <w:u w:val="single"/>
-                        </w:rPr>
-                        <w:t>us</w:t>
-                      </w:r>
-                      <w:r>
-                        <w:rPr>
-                          <w:b/>
-                          <w:spacing w:val="-2"/>
-                          <w:sz w:val="24"/>
-                          <w:szCs w:val="36"/>
-                          <w:u w:val="single"/>
-                        </w:rPr>
-                        <w:t>ers.name.full</w:t>
-                      </w:r>
-                      <w:proofErr w:type="spellEnd"/>
-                      <w:r>
-                        <w:rPr>
-                          <w:b/>
-                          <w:spacing w:val="-2"/>
-                          <w:sz w:val="24"/>
-                          <w:szCs w:val="36"/>
-                          <w:u w:val="single"/>
-                        </w:rPr>
-                        <w:t>() }}</w:t>
-                      </w:r>
-                      <w:r>
-                        <w:rPr>
-                          <w:bCs/>
-                          <w:spacing w:val="-2"/>
-                          <w:sz w:val="24"/>
-                          <w:szCs w:val="36"/>
-                        </w:rPr>
-                        <w:t>{% else %}</w:t>
-                      </w:r>
-                      <w:r>
-                        <w:rPr>
-                          <w:b/>
-                          <w:spacing w:val="-2"/>
-                          <w:sz w:val="24"/>
-                          <w:szCs w:val="36"/>
-                          <w:u w:val="single"/>
-                        </w:rPr>
-                        <w:t xml:space="preserve">{{ </w:t>
-                      </w:r>
-                      <w:proofErr w:type="spellStart"/>
-                      <w:r>
-                        <w:rPr>
-                          <w:b/>
-                          <w:spacing w:val="-2"/>
-                          <w:sz w:val="24"/>
-                          <w:szCs w:val="36"/>
-                          <w:u w:val="single"/>
-                        </w:rPr>
-                        <w:t>other_parties.name.full</w:t>
-                      </w:r>
-                      <w:proofErr w:type="spellEnd"/>
-                      <w:r>
-                        <w:rPr>
-                          <w:b/>
-                          <w:spacing w:val="-2"/>
-                          <w:sz w:val="24"/>
-                          <w:szCs w:val="36"/>
-                          <w:u w:val="single"/>
-                        </w:rPr>
-                        <w:t>() }}</w:t>
-                      </w:r>
-                      <w:r>
-                        <w:rPr>
-                          <w:bCs/>
-                          <w:spacing w:val="-2"/>
-                          <w:sz w:val="24"/>
-                          <w:szCs w:val="36"/>
-                        </w:rPr>
-                        <w:t xml:space="preserve">{% </w:t>
-                      </w:r>
-                      <w:r>
-                        <w:rPr>
-                          <w:bCs/>
-                          <w:spacing w:val="-2"/>
-                          <w:sz w:val="24"/>
-                          <w:szCs w:val="36"/>
-                        </w:rPr>
-                        <w:t>endif %}</w:t>
-                      </w:r>
-                    </w:p>
-                    <w:p>
-                      <w:pPr>
-                        <w:ind w:left="1662"/>
-                        <w:rPr>
-                          <w:b/>
-                          <w:spacing w:val="-2"/>
-                          <w:sz w:val="16"/>
-                        </w:rPr>
-                      </w:pPr>
-                    </w:p>
-                    <w:p>
-                      <w:pPr>
-                        <w:ind w:left="1662"/>
-                        <w:rPr>
-                          <w:b/>
-                          <w:spacing w:val="-2"/>
-                          <w:sz w:val="16"/>
-                        </w:rPr>
-                      </w:pPr>
-                      <w:r>
-                        <w:rPr>
-                          <w:b/>
-                          <w:spacing w:val="-2"/>
-                          <w:sz w:val="16"/>
-                        </w:rPr>
-                        <w:t>(</w:t>
-                      </w:r>
-                      <w:r>
-                        <w:rPr>
-                          <w:b/>
-                          <w:spacing w:val="-2"/>
-                          <w:sz w:val="13"/>
-                        </w:rPr>
-                        <w:t>PETITIONER</w:t>
-                      </w:r>
-                      <w:r>
-                        <w:rPr>
-                          <w:b/>
-                          <w:spacing w:val="-2"/>
-                          <w:sz w:val="16"/>
-                        </w:rPr>
-                        <w:t>)</w:t>
-                      </w:r>
-                    </w:p>
-                    <w:p>
-                      <w:pPr>
-                        <w:rPr>
-                          <w:b/>
-                          <w:spacing w:val="-2"/>
-                          <w:sz w:val="24"/>
-                        </w:rPr>
-                      </w:pPr>
-                      <w:r>
-                        <w:rPr>
-                          <w:b/>
-                          <w:spacing w:val="-2"/>
-                          <w:sz w:val="24"/>
-                        </w:rPr>
-                        <w:t>VERSUS</w:t>
-                      </w:r>
-                    </w:p>
-                    <w:p>
-                      <w:pPr>
-                        <w:rPr>
-                          <w:b/>
-                          <w:spacing w:val="-2"/>
-                          <w:sz w:val="24"/>
-                        </w:rPr>
-                      </w:pPr>
-                    </w:p>
-                    <w:p>
-                      <w:pPr>
-                        <w:spacing w:before="143"/>
-                        <w:rPr>
-                          <w:bCs/>
-                          <w:spacing w:val="-2"/>
-                          <w:sz w:val="24"/>
-                          <w:szCs w:val="36"/>
-                        </w:rPr>
-                      </w:pPr>
-                      <w:r>
-                        <w:rPr>
-                          <w:bCs/>
-                          <w:spacing w:val="-2"/>
-                          <w:sz w:val="24"/>
-                          <w:szCs w:val="36"/>
-                        </w:rPr>
-                        <w:t xml:space="preserve">{% if </w:t>
-                      </w:r>
-                      <w:proofErr w:type="spellStart"/>
-                      <w:r>
-                        <w:rPr>
-                          <w:bCs/>
-                          <w:spacing w:val="-2"/>
-                          <w:sz w:val="24"/>
-                          <w:szCs w:val="36"/>
-                        </w:rPr>
-                        <w:t>user_ask_role</w:t>
-                      </w:r>
-                      <w:proofErr w:type="spellEnd"/>
-                      <w:r>
-                        <w:rPr>
-                          <w:bCs/>
-                          <w:spacing w:val="-2"/>
-                          <w:sz w:val="24"/>
-                          <w:szCs w:val="36"/>
-                        </w:rPr>
-                        <w:t xml:space="preserve"> == </w:t>
-                      </w:r>
-                      <w:r>
-                        <w:rPr>
-                          <w:bCs/>
-                          <w:spacing w:val="-2"/>
-                          <w:sz w:val="24"/>
-                          <w:szCs w:val="36"/>
-                        </w:rPr>
-                        <w:t>‘</w:t>
-                      </w:r>
-                      <w:r>
-                        <w:rPr>
-                          <w:bCs/>
-                          <w:spacing w:val="-2"/>
-                          <w:sz w:val="24"/>
-                          <w:szCs w:val="36"/>
-                        </w:rPr>
-                        <w:t>defendant’ %}</w:t>
-                      </w:r>
-                      <w:r>
-                        <w:rPr>
-                          <w:b/>
-                          <w:spacing w:val="-2"/>
-                          <w:sz w:val="24"/>
-                          <w:szCs w:val="36"/>
-                          <w:u w:val="single"/>
-                        </w:rPr>
-                        <w:t xml:space="preserve">{{ </w:t>
-                      </w:r>
-                      <w:proofErr w:type="spellStart"/>
-                      <w:r>
-                        <w:rPr>
-                          <w:b/>
-                          <w:spacing w:val="-2"/>
-                          <w:sz w:val="24"/>
-                          <w:szCs w:val="36"/>
-                          <w:u w:val="single"/>
-                        </w:rPr>
-                        <w:t>us</w:t>
-                      </w:r>
-                      <w:r>
-                        <w:rPr>
-                          <w:b/>
-                          <w:spacing w:val="-2"/>
-                          <w:sz w:val="24"/>
-                          <w:szCs w:val="36"/>
-                          <w:u w:val="single"/>
-                        </w:rPr>
-                        <w:t>ers</w:t>
-                      </w:r>
-                      <w:r>
-                        <w:rPr>
-                          <w:b/>
-                          <w:spacing w:val="-2"/>
-                          <w:sz w:val="24"/>
-                          <w:szCs w:val="36"/>
-                          <w:u w:val="single"/>
-                        </w:rPr>
-                        <w:t>.name.full</w:t>
-                      </w:r>
-                      <w:proofErr w:type="spellEnd"/>
-                      <w:r>
-                        <w:rPr>
-                          <w:b/>
-                          <w:spacing w:val="-2"/>
-                          <w:sz w:val="24"/>
-                          <w:szCs w:val="36"/>
-                          <w:u w:val="single"/>
-                        </w:rPr>
-                        <w:t>() }}</w:t>
-                      </w:r>
-                      <w:r>
-                        <w:rPr>
-                          <w:bCs/>
-                          <w:spacing w:val="-2"/>
-                          <w:sz w:val="24"/>
-                          <w:szCs w:val="36"/>
-                        </w:rPr>
-                        <w:t>{% else %}</w:t>
-                      </w:r>
-                      <w:r>
-                        <w:rPr>
-                          <w:b/>
-                          <w:spacing w:val="-2"/>
-                          <w:sz w:val="24"/>
-                          <w:szCs w:val="36"/>
-                          <w:u w:val="single"/>
-                        </w:rPr>
-                        <w:t xml:space="preserve">{{ </w:t>
-                      </w:r>
-                      <w:proofErr w:type="spellStart"/>
-                      <w:r>
-                        <w:rPr>
-                          <w:b/>
-                          <w:spacing w:val="-2"/>
-                          <w:sz w:val="24"/>
-                          <w:szCs w:val="36"/>
-                          <w:u w:val="single"/>
-                        </w:rPr>
-                        <w:t>other_parties.name.full</w:t>
-                      </w:r>
-                      <w:proofErr w:type="spellEnd"/>
-                      <w:r>
-                        <w:rPr>
-                          <w:b/>
-                          <w:spacing w:val="-2"/>
-                          <w:sz w:val="24"/>
-                          <w:szCs w:val="36"/>
-                          <w:u w:val="single"/>
-                        </w:rPr>
-                        <w:t>() }}</w:t>
-                      </w:r>
-                      <w:r>
-                        <w:rPr>
-                          <w:bCs/>
-                          <w:spacing w:val="-2"/>
-                          <w:sz w:val="24"/>
-                          <w:szCs w:val="36"/>
-                        </w:rPr>
-                        <w:t xml:space="preserve">{% </w:t>
-                      </w:r>
-                      <w:r>
-                        <w:rPr>
-                          <w:bCs/>
-                          <w:spacing w:val="-2"/>
-                          <w:sz w:val="24"/>
-                          <w:szCs w:val="36"/>
-                        </w:rPr>
-                        <w:t>endif %}</w:t>
-                      </w:r>
-                    </w:p>
-                    <w:p>
-                      <w:pPr>
-                        <w:spacing w:line="183" w:lineRule="exact"/>
-                        <w:ind w:left="1713"/>
-                        <w:rPr>
-                          <w:b/>
-                          <w:sz w:val="16"/>
-                        </w:rPr>
-                      </w:pPr>
-                      <w:r>
-                        <w:rPr>
-                          <w:b/>
-                          <w:spacing w:val="-2"/>
-                          <w:sz w:val="13"/>
-                        </w:rPr>
-                        <w:t>(DEFENDANT</w:t>
-                      </w:r>
-                      <w:r>
-                        <w:rPr>
-                          <w:b/>
-                          <w:spacing w:val="-2"/>
-                          <w:sz w:val="16"/>
-                        </w:rPr>
-                        <w:t>)</w:t>
-                      </w:r>
-                    </w:p>
-                    <w:p>
-                      <w:pPr>
-                        <w:rPr>
-                          <w:b/>
-                          <w:sz w:val="16"/>
-                        </w:rPr>
-                      </w:pPr>
-                    </w:p>
-                  </w:txbxContent>
-                </v:textbox>
-                <w10:wrap type="square"/>
-              </v:shape>
-            </w:pict>
-          </mc:Fallback>
-        </mc:AlternateContent>
-      </w:r>
     </w:p>
     <w:p>
       <w:pPr>
@@ -3294,48 +3548,19 @@
     </w:p>
     <w:p>
       <w:pPr>
-        <w:pStyle w:val="Heading2"/>
-        <w:tabs>
-          <w:tab w:val="left" w:pos="2437"/>
-        </w:tabs>
-        <w:spacing w:before="182"/>
-        <w:ind w:left="0"/>
-        <w:rPr>
-          <w:b w:val="0"/>
+        <w:pStyle w:val="BodyText"/>
+        <w:spacing w:before="8"/>
+        <w:rPr>
+          <w:b/>
+          <w:sz w:val="25"/>
         </w:rPr>
       </w:pPr>
     </w:p>
     <w:p>
       <w:pPr>
         <w:pStyle w:val="Heading2"/>
-        <w:tabs>
-          <w:tab w:val="left" w:pos="2437"/>
-        </w:tabs>
-        <w:spacing w:before="182"/>
+        <w:spacing w:line="412" w:lineRule="auto"/>
         <w:ind w:left="0"/>
-        <w:rPr>
-          <w:b w:val="0"/>
-        </w:rPr>
-      </w:pPr>
-    </w:p>
-    <w:p>
-      <w:pPr>
-        <w:pStyle w:val="BodyText"/>
-        <w:spacing w:before="8"/>
-        <w:rPr>
-          <w:b/>
-          <w:sz w:val="25"/>
-        </w:rPr>
-      </w:pPr>
-    </w:p>
-    <w:p>
-      <w:pPr>
-        <w:pStyle w:val="BodyText"/>
-        <w:spacing w:before="8"/>
-        <w:rPr>
-          <w:b/>
-          <w:sz w:val="25"/>
-        </w:rPr>
       </w:pPr>
     </w:p>
     <w:p>
@@ -4095,49 +4320,87 @@
       </w:r>
       <w:r>
         <w:rPr>
-          <w:u w:val="thick"/>
+          <w:b/>
+          <w:bCs/>
+          <w:u w:val="single"/>
         </w:rPr>
         <w:t xml:space="preserve">{{ </w:t>
       </w:r>
       <w:proofErr w:type="spellStart"/>
       <w:r>
         <w:rPr>
-          <w:u w:val="thick"/>
-        </w:rPr>
-        <w:t>users.name.full</w:t>
+          <w:b/>
+          <w:bCs/>
+          <w:u w:val="single"/>
+        </w:rPr>
+        <w:t>user_names</w:t>
       </w:r>
       <w:proofErr w:type="spellEnd"/>
       <w:r>
         <w:rPr>
-          <w:u w:val="thick"/>
-        </w:rPr>
-        <w:t>() }}</w:t>
+          <w:b/>
+          <w:bCs/>
+          <w:u w:val="single"/>
+        </w:rPr>
+        <w:t xml:space="preserve"> }}</w:t>
+      </w:r>
+      <w:r>
+        <w:rPr>
+          <w:b/>
+          <w:bCs/>
+        </w:rPr>
+        <w:t xml:space="preserve"> </w:t>
       </w:r>
       <w:r>
         <w:t xml:space="preserve">v. </w:t>
       </w:r>
       <w:r>
         <w:rPr>
-          <w:u w:val="thick"/>
+          <w:b/>
+          <w:bCs/>
+          <w:u w:val="single"/>
         </w:rPr>
         <w:t xml:space="preserve">{{ </w:t>
       </w:r>
       <w:proofErr w:type="spellStart"/>
       <w:r>
         <w:rPr>
-          <w:u w:val="thick"/>
-        </w:rPr>
-        <w:t>other_parties.name.full</w:t>
+          <w:b/>
+          <w:bCs/>
+          <w:u w:val="single"/>
+        </w:rPr>
+        <w:t>other_parties</w:t>
+      </w:r>
+      <w:r>
+        <w:rPr>
+          <w:b/>
+          <w:bCs/>
+          <w:u w:val="single"/>
+        </w:rPr>
+        <w:t>_names</w:t>
       </w:r>
       <w:proofErr w:type="spellEnd"/>
       <w:r>
         <w:rPr>
-          <w:u w:val="thick"/>
-        </w:rPr>
-        <w:t>() }}</w:t>
-      </w:r>
-      <w:r>
-        <w:t>(case</w:t>
+          <w:b/>
+          <w:bCs/>
+          <w:u w:val="single"/>
+        </w:rPr>
+        <w:t xml:space="preserve"> }}</w:t>
+      </w:r>
+      <w:r>
+        <w:rPr>
+          <w:b/>
+          <w:bCs/>
+          <w:u w:val="single"/>
+        </w:rPr>
+        <w:t xml:space="preserve"> </w:t>
+      </w:r>
+      <w:r>
+        <w:t>(</w:t>
+      </w:r>
+      <w:r>
+        <w:t>case</w:t>
       </w:r>
       <w:r>
         <w:rPr>
@@ -4168,6 +4431,7 @@
       <w:r>
         <w:t xml:space="preserve"> </w:t>
       </w:r>
+      <w:proofErr w:type="gramStart"/>
       <w:r>
         <w:rPr>
           <w:b/>
@@ -4183,7 +4447,16 @@
           <w:bCs/>
           <w:u w:val="single"/>
         </w:rPr>
-        <w:t>date_of_</w:t>
+        <w:t>date</w:t>
+      </w:r>
+      <w:proofErr w:type="gramEnd"/>
+      <w:r>
+        <w:rPr>
+          <w:b/>
+          <w:bCs/>
+          <w:u w:val="single"/>
+        </w:rPr>
+        <w:t>_of_</w:t>
       </w:r>
       <w:r>
         <w:rPr>
@@ -4331,11 +4604,11 @@
         </w:rPr>
         <w:t xml:space="preserve"> </w:t>
       </w:r>
-      <w:r>
-        <w:rPr>
-          <w:b/>
-          <w:bCs/>
-          <w:spacing w:val="40"/>
+      <w:proofErr w:type="gramStart"/>
+      <w:r>
+        <w:rPr>
+          <w:b/>
+          <w:bCs/>
           <w:u w:val="single"/>
         </w:rPr>
         <w:t xml:space="preserve">{{ </w:t>
@@ -4345,25 +4618,29 @@
         <w:rPr>
           <w:b/>
           <w:bCs/>
-          <w:spacing w:val="40"/>
-          <w:u w:val="single"/>
-        </w:rPr>
-        <w:t>who_violated_the_judgment</w:t>
+          <w:u w:val="single"/>
+        </w:rPr>
+        <w:t>who</w:t>
+      </w:r>
+      <w:proofErr w:type="gramEnd"/>
+      <w:r>
+        <w:rPr>
+          <w:b/>
+          <w:bCs/>
+          <w:u w:val="single"/>
+        </w:rPr>
+        <w:t>_violated_the_judgment</w:t>
       </w:r>
       <w:proofErr w:type="spellEnd"/>
       <w:r>
         <w:rPr>
           <w:b/>
           <w:bCs/>
-          <w:spacing w:val="40"/>
           <w:u w:val="single"/>
         </w:rPr>
         <w:t xml:space="preserve"> }}</w:t>
       </w:r>
       <w:r>
-        <w:rPr>
-          <w:spacing w:val="-2"/>
-        </w:rPr>
         <w:t xml:space="preserve"> </w:t>
       </w:r>
       <w:r>
@@ -4449,7 +4726,11 @@
         </w:rPr>
       </w:pPr>
       <w:r>
-        <w:t>Contempt of Court for the following reasons</w:t>
+        <w:t xml:space="preserve">Contempt of Court for the following </w:t>
+      </w:r>
+      <w:proofErr w:type="gramStart"/>
+      <w:r>
+        <w:t>reasons</w:t>
       </w:r>
       <w:r>
         <w:t>:</w:t>
@@ -4460,7 +4741,16 @@
           <w:bCs/>
           <w:u w:val="single"/>
         </w:rPr>
-        <w:t xml:space="preserve">{{ </w:t>
+        <w:t>{</w:t>
+      </w:r>
+      <w:proofErr w:type="gramEnd"/>
+      <w:r>
+        <w:rPr>
+          <w:b/>
+          <w:bCs/>
+          <w:u w:val="single"/>
+        </w:rPr>
+        <w:t xml:space="preserve">{ </w:t>
       </w:r>
       <w:proofErr w:type="spellStart"/>
       <w:r>
@@ -4524,13 +4814,23 @@
       <w:r>
         <w:t xml:space="preserve">Respectfully Submitted: Signature: </w:t>
       </w:r>
-      <w:r>
-        <w:rPr>
-          <w:b/>
-          <w:bCs/>
-          <w:u w:val="single"/>
-        </w:rPr>
-        <w:t>{{ users[0].signature }}</w:t>
+      <w:proofErr w:type="gramStart"/>
+      <w:r>
+        <w:rPr>
+          <w:b/>
+          <w:bCs/>
+          <w:u w:val="single"/>
+        </w:rPr>
+        <w:t>{{ users</w:t>
+      </w:r>
+      <w:proofErr w:type="gramEnd"/>
+      <w:r>
+        <w:rPr>
+          <w:b/>
+          <w:bCs/>
+          <w:u w:val="single"/>
+        </w:rPr>
+        <w:t>[0].signature }}</w:t>
       </w:r>
     </w:p>
     <w:p>
@@ -4544,13 +4844,23 @@
       <w:r>
         <w:t xml:space="preserve">Name: </w:t>
       </w:r>
-      <w:r>
-        <w:rPr>
-          <w:b/>
-          <w:bCs/>
-          <w:u w:val="single"/>
-        </w:rPr>
-        <w:t>{{ users[0].</w:t>
+      <w:proofErr w:type="gramStart"/>
+      <w:r>
+        <w:rPr>
+          <w:b/>
+          <w:bCs/>
+          <w:u w:val="single"/>
+        </w:rPr>
+        <w:t>{{ users</w:t>
+      </w:r>
+      <w:proofErr w:type="gramEnd"/>
+      <w:r>
+        <w:rPr>
+          <w:b/>
+          <w:bCs/>
+          <w:u w:val="single"/>
+        </w:rPr>
+        <w:t>[0].</w:t>
       </w:r>
       <w:proofErr w:type="spellStart"/>
       <w:r>
@@ -4592,13 +4902,23 @@
       <w:r>
         <w:t xml:space="preserve">Address: </w:t>
       </w:r>
-      <w:r>
-        <w:rPr>
-          <w:b/>
-          <w:bCs/>
-          <w:u w:val="single"/>
-        </w:rPr>
-        <w:t>{{ users[0].</w:t>
+      <w:proofErr w:type="gramStart"/>
+      <w:r>
+        <w:rPr>
+          <w:b/>
+          <w:bCs/>
+          <w:u w:val="single"/>
+        </w:rPr>
+        <w:t>{{ users</w:t>
+      </w:r>
+      <w:proofErr w:type="gramEnd"/>
+      <w:r>
+        <w:rPr>
+          <w:b/>
+          <w:bCs/>
+          <w:u w:val="single"/>
+        </w:rPr>
+        <w:t>[0].</w:t>
       </w:r>
       <w:proofErr w:type="spellStart"/>
       <w:r>
@@ -4643,181 +4963,6 @@
           <w:sz w:val="16"/>
         </w:rPr>
       </w:pPr>
-    </w:p>
-    <w:p>
-      <w:pPr>
-        <w:pStyle w:val="BodyText"/>
-        <w:tabs>
-          <w:tab w:val="left" w:pos="9514"/>
-        </w:tabs>
-        <w:spacing w:before="90"/>
-        <w:ind w:left="5527"/>
-      </w:pPr>
-      <w:r>
-        <w:t xml:space="preserve">City, State Zip: </w:t>
-      </w:r>
-      <w:r>
-        <w:rPr>
-          <w:b/>
-          <w:bCs/>
-          <w:u w:val="single"/>
-        </w:rPr>
-        <w:t>{{ users</w:t>
-      </w:r>
-      <w:r>
-        <w:rPr>
-          <w:b/>
-          <w:bCs/>
-          <w:u w:val="single"/>
-        </w:rPr>
-        <w:t>[0].</w:t>
-      </w:r>
-      <w:proofErr w:type="spellStart"/>
-      <w:r>
-        <w:rPr>
-          <w:b/>
-          <w:bCs/>
-          <w:u w:val="single"/>
-        </w:rPr>
-        <w:t>address.</w:t>
-      </w:r>
-      <w:r>
-        <w:rPr>
-          <w:b/>
-          <w:bCs/>
-          <w:u w:val="single"/>
-        </w:rPr>
-        <w:t>city</w:t>
-      </w:r>
-      <w:proofErr w:type="spellEnd"/>
-      <w:r>
-        <w:rPr>
-          <w:b/>
-          <w:bCs/>
-          <w:u w:val="single"/>
-        </w:rPr>
-        <w:t xml:space="preserve"> }}</w:t>
-      </w:r>
-      <w:r>
-        <w:rPr>
-          <w:b/>
-          <w:bCs/>
-        </w:rPr>
-        <w:t>,</w:t>
-      </w:r>
-      <w:r>
-        <w:rPr>
-          <w:b/>
-          <w:bCs/>
-          <w:u w:val="single"/>
-        </w:rPr>
-        <w:t xml:space="preserve"> </w:t>
-      </w:r>
-      <w:r>
-        <w:rPr>
-          <w:b/>
-          <w:bCs/>
-          <w:u w:val="single"/>
-        </w:rPr>
-        <w:t xml:space="preserve">{{ </w:t>
-      </w:r>
-      <w:r>
-        <w:rPr>
-          <w:b/>
-          <w:bCs/>
-          <w:u w:val="single"/>
-        </w:rPr>
-        <w:t>users</w:t>
-      </w:r>
-      <w:r>
-        <w:rPr>
-          <w:b/>
-          <w:bCs/>
-          <w:u w:val="single"/>
-        </w:rPr>
-        <w:t>[0].</w:t>
-      </w:r>
-      <w:proofErr w:type="spellStart"/>
-      <w:r>
-        <w:rPr>
-          <w:b/>
-          <w:bCs/>
-          <w:u w:val="single"/>
-        </w:rPr>
-        <w:t>address.</w:t>
-      </w:r>
-      <w:r>
-        <w:rPr>
-          <w:b/>
-          <w:bCs/>
-          <w:u w:val="single"/>
-        </w:rPr>
-        <w:t>state</w:t>
-      </w:r>
-      <w:proofErr w:type="spellEnd"/>
-      <w:r>
-        <w:rPr>
-          <w:b/>
-          <w:bCs/>
-          <w:u w:val="single"/>
-        </w:rPr>
-        <w:t xml:space="preserve"> }}</w:t>
-      </w:r>
-      <w:r>
-        <w:rPr>
-          <w:b/>
-          <w:bCs/>
-        </w:rPr>
-        <w:t>,</w:t>
-      </w:r>
-      <w:r>
-        <w:rPr>
-          <w:b/>
-          <w:bCs/>
-          <w:u w:val="single"/>
-        </w:rPr>
-        <w:t xml:space="preserve"> </w:t>
-      </w:r>
-      <w:r>
-        <w:rPr>
-          <w:b/>
-          <w:bCs/>
-          <w:u w:val="single"/>
-        </w:rPr>
-        <w:t xml:space="preserve">{{ </w:t>
-      </w:r>
-      <w:r>
-        <w:rPr>
-          <w:b/>
-          <w:bCs/>
-          <w:u w:val="single"/>
-        </w:rPr>
-        <w:t>users</w:t>
-      </w:r>
-      <w:r>
-        <w:rPr>
-          <w:b/>
-          <w:bCs/>
-          <w:u w:val="single"/>
-        </w:rPr>
-        <w:t>[0].address.</w:t>
-      </w:r>
-      <w:r>
-        <w:rPr>
-          <w:b/>
-          <w:bCs/>
-          <w:u w:val="single"/>
-        </w:rPr>
-        <w:t>zip</w:t>
-      </w:r>
-      <w:r>
-        <w:rPr>
-          <w:b/>
-          <w:bCs/>
-          <w:u w:val="single"/>
-        </w:rPr>
-        <w:t xml:space="preserve"> }}</w:t>
-      </w:r>
     </w:p>
     <w:p>
       <w:pPr>
@@ -4840,6 +4985,7 @@
       <w:r>
         <w:t xml:space="preserve">Telephone: </w:t>
       </w:r>
+      <w:proofErr w:type="gramStart"/>
       <w:r>
         <w:rPr>
           <w:b/>
@@ -4855,7 +5001,16 @@
           <w:bCs/>
           <w:u w:val="single"/>
         </w:rPr>
-        <w:t>user_phone_number</w:t>
+        <w:t>user</w:t>
+      </w:r>
+      <w:proofErr w:type="gramEnd"/>
+      <w:r>
+        <w:rPr>
+          <w:b/>
+          <w:bCs/>
+          <w:u w:val="single"/>
+        </w:rPr>
+        <w:t>_phone_number</w:t>
       </w:r>
       <w:proofErr w:type="spellEnd"/>
       <w:r>
@@ -5177,8 +5332,9 @@
     <w:p>
       <w:pPr>
         <w:pStyle w:val="BodyText"/>
-        <w:rPr>
-          <w:sz w:val="20"/>
+        <w:spacing w:before="9"/>
+        <w:rPr>
+          <w:sz w:val="27"/>
         </w:rPr>
       </w:pPr>
     </w:p>
@@ -5186,18 +5342,16 @@
       <w:pPr>
         <w:pStyle w:val="BodyText"/>
         <w:spacing w:before="9"/>
+        <w:ind w:left="2261" w:firstLine="720"/>
         <w:rPr>
           <w:sz w:val="27"/>
         </w:rPr>
       </w:pPr>
       <w:r>
-        <w:pict w14:anchorId="3D6BB862">
-          <v:group id="docshapegroup9" o:spid="_x0000_s2053" style="position:absolute;margin-left:216.05pt;margin-top:17.15pt;width:288.05pt;height:1.3pt;z-index:-15724544;mso-wrap-distance-left:0;mso-wrap-distance-right:0;mso-position-horizontal-relative:page" coordorigin="4321,343" coordsize="5761,26">
-            <v:line id="_x0000_s2055" style="position:absolute" from="4321,364" to="6841,364" strokeweight=".48pt"/>
-            <v:rect id="docshape10" o:spid="_x0000_s2054" style="position:absolute;left:6841;top:343;width:3241;height:12" fillcolor="black" stroked="f"/>
-            <w10:wrap type="topAndBottom" anchorx="page"/>
-          </v:group>
-        </w:pict>
+        <w:rPr>
+          <w:sz w:val="27"/>
+        </w:rPr>
+        <w:t>_______________________________</w:t>
       </w:r>
     </w:p>
     <w:p>
@@ -5211,6 +5365,7 @@
       <w:r>
         <w:t xml:space="preserve">JUDGE, </w:t>
       </w:r>
+      <w:proofErr w:type="gramStart"/>
       <w:r>
         <w:rPr>
           <w:u w:val="single"/>
@@ -5222,7 +5377,14 @@
         <w:rPr>
           <w:u w:val="single"/>
         </w:rPr>
-        <w:t>judicial_district</w:t>
+        <w:t>judicial</w:t>
+      </w:r>
+      <w:proofErr w:type="gramEnd"/>
+      <w:r>
+        <w:rPr>
+          <w:u w:val="single"/>
+        </w:rPr>
+        <w:t>_district</w:t>
       </w:r>
       <w:proofErr w:type="spellEnd"/>
       <w:r>
@@ -5310,15 +5472,45 @@
         <w:t xml:space="preserve">  </w:t>
       </w:r>
       <w:r>
-        <w:rPr>
-          <w:b/>
-          <w:bCs/>
-          <w:u w:val="single"/>
-        </w:rPr>
-        <w:t xml:space="preserve">{{ </w:t>
+        <w:t>{%</w:t>
+      </w:r>
+      <w:r>
+        <w:t xml:space="preserve"> </w:t>
+      </w:r>
+      <w:r>
+        <w:t xml:space="preserve">if </w:t>
       </w:r>
       <w:proofErr w:type="spellStart"/>
       <w:r>
+        <w:t>plantiff_or_defendant_attorney</w:t>
+      </w:r>
+      <w:proofErr w:type="spellEnd"/>
+      <w:r>
+        <w:t xml:space="preserve"> == False </w:t>
+      </w:r>
+      <w:proofErr w:type="gramStart"/>
+      <w:r>
+        <w:t>%}</w:t>
+      </w:r>
+      <w:r>
+        <w:rPr>
+          <w:b/>
+          <w:bCs/>
+          <w:u w:val="single"/>
+        </w:rPr>
+        <w:t>{</w:t>
+      </w:r>
+      <w:proofErr w:type="gramEnd"/>
+      <w:r>
+        <w:rPr>
+          <w:b/>
+          <w:bCs/>
+          <w:u w:val="single"/>
+        </w:rPr>
+        <w:t xml:space="preserve">{ </w:t>
+      </w:r>
+      <w:proofErr w:type="spellStart"/>
+      <w:r>
         <w:rPr>
           <w:b/>
           <w:bCs/>
@@ -5345,6 +5537,57 @@
       </w:r>
       <w:r>
         <w:t xml:space="preserve"> </w:t>
+      </w:r>
+      <w:r>
+        <w:t xml:space="preserve">{% else %} </w:t>
+      </w:r>
+      <w:r>
+        <w:rPr>
+          <w:b/>
+          <w:bCs/>
+          <w:u w:val="single"/>
+        </w:rPr>
+        <w:t>{{ attorney</w:t>
+      </w:r>
+      <w:r>
+        <w:rPr>
+          <w:b/>
+          <w:bCs/>
+          <w:u w:val="single"/>
+        </w:rPr>
+        <w:t>[0]</w:t>
+      </w:r>
+      <w:r>
+        <w:rPr>
+          <w:b/>
+          <w:bCs/>
+          <w:u w:val="single"/>
+        </w:rPr>
+        <w:t>.</w:t>
+      </w:r>
+      <w:proofErr w:type="spellStart"/>
+      <w:r>
+        <w:rPr>
+          <w:b/>
+          <w:bCs/>
+          <w:u w:val="single"/>
+        </w:rPr>
+        <w:t>name.full</w:t>
+      </w:r>
+      <w:proofErr w:type="spellEnd"/>
+      <w:r>
+        <w:rPr>
+          <w:b/>
+          <w:bCs/>
+          <w:u w:val="single"/>
+        </w:rPr>
+        <w:t>() }}</w:t>
+      </w:r>
+      <w:r>
+        <w:rPr>
+          <w:spacing w:val="-2"/>
+        </w:rPr>
+        <w:t>{% endif %}</w:t>
       </w:r>
       <w:r>
         <w:rPr>
@@ -5371,47 +5614,47 @@
         <w:ind w:left="100"/>
       </w:pPr>
       <w:r>
-        <w:rPr>
-          <w:b/>
-          <w:bCs/>
-          <w:u w:val="single"/>
-        </w:rPr>
-        <w:t xml:space="preserve">{{ </w:t>
+        <w:t xml:space="preserve">{% if </w:t>
       </w:r>
       <w:proofErr w:type="spellStart"/>
       <w:r>
-        <w:rPr>
-          <w:b/>
-          <w:bCs/>
-          <w:u w:val="single"/>
-        </w:rPr>
-        <w:t>who_violated_the_judgment</w:t>
-      </w:r>
-      <w:r>
-        <w:rPr>
-          <w:b/>
-          <w:bCs/>
-          <w:u w:val="single"/>
-        </w:rPr>
-        <w:t>_location.</w:t>
-      </w:r>
-      <w:r>
-        <w:rPr>
-          <w:b/>
-          <w:bCs/>
-          <w:u w:val="single"/>
-        </w:rPr>
-        <w:t>address.on_one_line</w:t>
+        <w:t>plantiff_or_defendant_attorney</w:t>
       </w:r>
       <w:proofErr w:type="spellEnd"/>
       <w:r>
-        <w:rPr>
-          <w:b/>
-          <w:bCs/>
-          <w:u w:val="single"/>
-        </w:rPr>
-        <w:t>()</w:t>
-      </w:r>
+        <w:t xml:space="preserve"> == False </w:t>
+      </w:r>
+      <w:proofErr w:type="gramStart"/>
+      <w:r>
+        <w:t>%}</w:t>
+      </w:r>
+      <w:r>
+        <w:rPr>
+          <w:b/>
+          <w:bCs/>
+          <w:u w:val="single"/>
+        </w:rPr>
+        <w:t>{</w:t>
+      </w:r>
+      <w:proofErr w:type="gramEnd"/>
+      <w:r>
+        <w:rPr>
+          <w:b/>
+          <w:bCs/>
+          <w:u w:val="single"/>
+        </w:rPr>
+        <w:t xml:space="preserve">{ </w:t>
+      </w:r>
+      <w:proofErr w:type="spellStart"/>
+      <w:r>
+        <w:rPr>
+          <w:b/>
+          <w:bCs/>
+          <w:u w:val="single"/>
+        </w:rPr>
+        <w:t>who_violated_the_judgment.address.address</w:t>
+      </w:r>
+      <w:proofErr w:type="spellEnd"/>
       <w:r>
         <w:rPr>
           <w:b/>
@@ -5421,16 +5664,83 @@
         <w:t xml:space="preserve"> }}</w:t>
       </w:r>
       <w:r>
-        <w:t xml:space="preserve"> </w:t>
-      </w:r>
-      <w:r>
-        <w:t xml:space="preserve"> </w:t>
-      </w:r>
-      <w:r>
-        <w:rPr>
+        <w:t xml:space="preserve"> {% else %} </w:t>
+      </w:r>
+      <w:r>
+        <w:rPr>
+          <w:b/>
+          <w:bCs/>
+          <w:u w:val="single"/>
+        </w:rPr>
+        <w:t>{{ attorney</w:t>
+      </w:r>
+      <w:r>
+        <w:rPr>
+          <w:b/>
+          <w:bCs/>
+          <w:u w:val="single"/>
+        </w:rPr>
+        <w:t>[0]</w:t>
+      </w:r>
+      <w:r>
+        <w:rPr>
+          <w:b/>
+          <w:bCs/>
+          <w:u w:val="single"/>
+        </w:rPr>
+        <w:t>.</w:t>
+      </w:r>
+      <w:proofErr w:type="spellStart"/>
+      <w:r>
+        <w:rPr>
+          <w:b/>
+          <w:bCs/>
+          <w:u w:val="single"/>
+        </w:rPr>
+        <w:t>address.address</w:t>
+      </w:r>
+      <w:proofErr w:type="spellEnd"/>
+      <w:r>
+        <w:rPr>
+          <w:b/>
+          <w:bCs/>
+          <w:u w:val="single"/>
+        </w:rPr>
+        <w:t xml:space="preserve"> }}</w:t>
+      </w:r>
+      <w:r>
+        <w:rPr>
+          <w:b/>
+          <w:bCs/>
           <w:spacing w:val="-2"/>
         </w:rPr>
-        <w:t>(Address)</w:t>
+        <w:t xml:space="preserve"> </w:t>
+      </w:r>
+      <w:r>
+        <w:rPr>
+          <w:b/>
+          <w:bCs/>
+          <w:spacing w:val="-2"/>
+        </w:rPr>
+        <w:t xml:space="preserve"> </w:t>
+      </w:r>
+      <w:r>
+        <w:rPr>
+          <w:spacing w:val="-2"/>
+        </w:rPr>
+        <w:t>{% endif %}</w:t>
+      </w:r>
+      <w:r>
+        <w:rPr>
+          <w:spacing w:val="-2"/>
+        </w:rPr>
+        <w:t>(</w:t>
+      </w:r>
+      <w:r>
+        <w:rPr>
+          <w:spacing w:val="-2"/>
+        </w:rPr>
+        <w:t>Address)</w:t>
       </w:r>
     </w:p>
     <w:p>
@@ -5440,6 +5750,67 @@
         <w:ind w:right="2190" w:firstLine="100"/>
       </w:pPr>
       <w:r>
+        <w:t xml:space="preserve">{% if </w:t>
+      </w:r>
+      <w:proofErr w:type="spellStart"/>
+      <w:r>
+        <w:t>plantiff_or_defendant_attorney</w:t>
+      </w:r>
+      <w:proofErr w:type="spellEnd"/>
+      <w:r>
+        <w:t xml:space="preserve"> == False </w:t>
+      </w:r>
+      <w:proofErr w:type="gramStart"/>
+      <w:r>
+        <w:t>%}</w:t>
+      </w:r>
+      <w:r>
+        <w:rPr>
+          <w:b/>
+          <w:bCs/>
+          <w:u w:val="single"/>
+        </w:rPr>
+        <w:t>{</w:t>
+      </w:r>
+      <w:proofErr w:type="gramEnd"/>
+      <w:r>
+        <w:rPr>
+          <w:b/>
+          <w:bCs/>
+          <w:u w:val="single"/>
+        </w:rPr>
+        <w:t xml:space="preserve">{ </w:t>
+      </w:r>
+      <w:proofErr w:type="spellStart"/>
+      <w:r>
+        <w:rPr>
+          <w:b/>
+          <w:bCs/>
+          <w:u w:val="single"/>
+        </w:rPr>
+        <w:t>who_violated_the_judgment</w:t>
+      </w:r>
+      <w:r>
+        <w:rPr>
+          <w:b/>
+          <w:bCs/>
+          <w:u w:val="single"/>
+        </w:rPr>
+        <w:t>_phone_number</w:t>
+      </w:r>
+      <w:proofErr w:type="spellEnd"/>
+      <w:r>
+        <w:rPr>
+          <w:b/>
+          <w:bCs/>
+          <w:u w:val="single"/>
+        </w:rPr>
+        <w:t xml:space="preserve"> }}</w:t>
+      </w:r>
+      <w:r>
+        <w:t xml:space="preserve"> {% else %} </w:t>
+      </w:r>
+      <w:r>
         <w:rPr>
           <w:b/>
           <w:bCs/>
@@ -5454,7 +5825,7 @@
           <w:bCs/>
           <w:u w:val="single"/>
         </w:rPr>
-        <w:t>who_violated_the_judgment</w:t>
+        <w:t>attorney</w:t>
       </w:r>
       <w:r>
         <w:rPr>
@@ -5471,18 +5842,13 @@
           <w:bCs/>
           <w:u w:val="single"/>
         </w:rPr>
-        <w:t xml:space="preserve"> </w:t>
-      </w:r>
-      <w:r>
-        <w:rPr>
-          <w:b/>
-          <w:bCs/>
-          <w:u w:val="single"/>
-        </w:rPr>
-        <w:t>}}</w:t>
-      </w:r>
-      <w:r>
-        <w:t xml:space="preserve"> </w:t>
+        <w:t xml:space="preserve"> }}</w:t>
+      </w:r>
+      <w:r>
+        <w:t xml:space="preserve"> </w:t>
+      </w:r>
+      <w:r>
+        <w:t>{% endif %}</w:t>
       </w:r>
       <w:r>
         <w:t>(Phone</w:t>

</xml_diff>